<commit_message>
CV: urutan pengalaman terbaru-dulu + rapikan tanggal
</commit_message>
<xml_diff>
--- a/cv/CV_DettaPranata.docx
+++ b/cv/CV_DettaPranata.docx
@@ -653,834 +653,71 @@
       </w:r>
     </w:p>
     <w:p>
-      <w:pPr>
-        <w:keepNext w:val="0"/>
-        <w:keepLines w:val="0"/>
-        <w:pageBreakBefore w:val="0"/>
-        <w:widowControl w:val="0"/>
-        <w:pBdr>
-          <w:top w:space="0" w:sz="0" w:val="nil"/>
-          <w:left w:space="0" w:sz="0" w:val="nil"/>
-          <w:bottom w:space="0" w:sz="0" w:val="nil"/>
-          <w:right w:space="0" w:sz="0" w:val="nil"/>
-          <w:between w:space="0" w:sz="0" w:val="nil"/>
-        </w:pBdr>
-        <w:shd w:fill="auto" w:val="clear"/>
-        <w:spacing w:after="0" w:before="288.3184814453125" w:line="240" w:lineRule="auto"/>
-        <w:ind w:left="1446.4999389648438" w:right="0" w:firstLine="0"/>
-        <w:jc w:val="left"/>
-        <w:rPr>
-          <w:rFonts w:ascii="Times New Roman" w:cs="Times New Roman" w:eastAsia="Times New Roman" w:hAnsi="Times New Roman"/>
-          <w:b w:val="1"/>
-          <w:bCs w:val="1"/>
-          <w:i w:val="0"/>
-          <w:iCs w:val="0"/>
-          <w:smallCaps w:val="0"/>
-          <w:strike w:val="0"/>
-          <w:color w:val="000000"/>
-          <w:sz w:val="24"/>
-          <w:szCs w:val="24"/>
-          <w:u w:val="none"/>
-          <w:shd w:fill="auto" w:val="clear"/>
-          <w:vertAlign w:val="baseline"/>
-        </w:rPr>
-      </w:pPr>
-      <w:r>
-        <w:rPr>
-          <w:rFonts w:ascii="Times New Roman" w:cs="Times New Roman" w:eastAsia="Times New Roman" w:hAnsi="Times New Roman"/>
-          <w:b w:val="1"/>
-          <w:bCs w:val="1"/>
-          <w:sz w:val="24"/>
-          <w:szCs w:val="24"/>
-          <w:rtl w:val="0"/>
-        </w:rPr>
-        <w:t xml:space="preserve">Assistant Survey</w:t>
-      </w:r>
-      <w:r>
-        <w:rPr>
-          <w:rtl w:val="0"/>
-        </w:rPr>
-      </w:r>
-    </w:p>
-    <w:p>
-      <w:pPr>
-        <w:keepNext w:val="0"/>
-        <w:keepLines w:val="0"/>
-        <w:pageBreakBefore w:val="0"/>
-        <w:widowControl w:val="0"/>
-        <w:pBdr>
-          <w:top w:space="0" w:sz="0" w:val="nil"/>
-          <w:left w:space="0" w:sz="0" w:val="nil"/>
-          <w:bottom w:space="0" w:sz="0" w:val="nil"/>
-          <w:right w:space="0" w:sz="0" w:val="nil"/>
-          <w:between w:space="0" w:sz="0" w:val="nil"/>
-        </w:pBdr>
-        <w:shd w:fill="auto" w:val="clear"/>
-        <w:spacing w:after="0" w:before="288.3184814453125" w:line="240" w:lineRule="auto"/>
-        <w:ind w:left="1446.4999389648438" w:right="0" w:firstLine="0"/>
-        <w:jc w:val="left"/>
-        <w:rPr>
-          <w:rFonts w:ascii="Times New Roman" w:cs="Times New Roman" w:eastAsia="Times New Roman" w:hAnsi="Times New Roman"/>
-          <w:b w:val="0"/>
-          <w:bCs w:val="0"/>
-          <w:i w:val="1"/>
-          <w:iCs w:val="1"/>
-          <w:smallCaps w:val="0"/>
-          <w:strike w:val="0"/>
-          <w:color w:val="000000"/>
-          <w:sz w:val="24"/>
-          <w:szCs w:val="24"/>
-          <w:u w:val="none"/>
-          <w:shd w:fill="auto" w:val="clear"/>
-          <w:vertAlign w:val="baseline"/>
-        </w:rPr>
-      </w:pPr>
-      <w:r>
-        <w:rPr>
-          <w:rFonts w:ascii="Times New Roman" w:cs="Times New Roman" w:eastAsia="Times New Roman" w:hAnsi="Times New Roman"/>
-          <w:b w:val="1"/>
-          <w:bCs w:val="1"/>
-          <w:i w:val="0"/>
-          <w:iCs w:val="0"/>
-          <w:smallCaps w:val="0"/>
-          <w:strike w:val="0"/>
-          <w:color w:val="000000"/>
-          <w:sz w:val="24"/>
-          <w:szCs w:val="24"/>
-          <w:u w:val="none"/>
-          <w:shd w:fill="auto" w:val="clear"/>
-          <w:vertAlign w:val="baseline"/>
-          <w:rtl w:val="0"/>
-        </w:rPr>
-        <w:t xml:space="preserve">PT. Anugrah Bumi Lestari </w:t>
-      </w:r>
-      <w:r>
-        <w:rPr>
-          <w:rFonts w:ascii="Times New Roman" w:cs="Times New Roman" w:eastAsia="Times New Roman" w:hAnsi="Times New Roman"/>
-          <w:b w:val="0"/>
-          <w:bCs w:val="0"/>
-          <w:i w:val="0"/>
-          <w:iCs w:val="0"/>
-          <w:smallCaps w:val="0"/>
-          <w:strike w:val="0"/>
-          <w:color w:val="000000"/>
-          <w:sz w:val="24"/>
-          <w:szCs w:val="24"/>
-          <w:u w:val="none"/>
-          <w:shd w:fill="auto" w:val="clear"/>
-          <w:vertAlign w:val="baseline"/>
-          <w:rtl w:val="0"/>
-        </w:rPr>
+      <w:r>
+        <w:rPr>
+          <w:b/>
+        </w:rPr>
+        <w:t xml:space="preserve"> </w:t>
+        <w:tab/>
+        <w:tab/>
+        <w:t>Mitra Statistik</w:t>
+      </w:r>
+    </w:p>
+    <w:p/>
+    <w:p>
+      <w:r>
+        <w:rPr>
+          <w:b/>
+        </w:rPr>
+        <w:tab/>
+        <w:t xml:space="preserve">BPS Kabupaten Lahat </w:t>
+      </w:r>
+      <w:r>
+        <w:rPr/>
         <w:t xml:space="preserve">| Lahat, Sumatra Selatan </w:t>
       </w:r>
       <w:r>
         <w:rPr>
-          <w:rFonts w:ascii="Times New Roman" w:cs="Times New Roman" w:eastAsia="Times New Roman" w:hAnsi="Times New Roman"/>
-          <w:b w:val="0"/>
-          <w:bCs w:val="0"/>
-          <w:i w:val="1"/>
-          <w:iCs w:val="1"/>
-          <w:smallCaps w:val="0"/>
-          <w:strike w:val="0"/>
-          <w:color w:val="000000"/>
-          <w:sz w:val="24"/>
-          <w:szCs w:val="24"/>
-          <w:u w:val="none"/>
-          <w:shd w:fill="auto" w:val="clear"/>
-          <w:vertAlign w:val="baseline"/>
-          <w:rtl w:val="0"/>
-        </w:rPr>
-        <w:t xml:space="preserve">Mei 2023 – </w:t>
-      </w:r>
-      <w:r>
-        <w:rPr>
-          <w:rFonts w:ascii="Times New Roman" w:cs="Times New Roman" w:eastAsia="Times New Roman" w:hAnsi="Times New Roman"/>
-          <w:i w:val="1"/>
-          <w:iCs w:val="1"/>
-          <w:sz w:val="24"/>
-          <w:szCs w:val="24"/>
-          <w:rtl w:val="0"/>
-        </w:rPr>
-        <w:t xml:space="preserve">Oktober 2025</w:t>
-      </w:r>
-      <w:r>
-        <w:rPr>
-          <w:rtl w:val="0"/>
-        </w:rPr>
-      </w:r>
-    </w:p>
-    <w:p>
-      <w:pPr>
-        <w:keepNext w:val="0"/>
-        <w:keepLines w:val="0"/>
-        <w:pageBreakBefore w:val="0"/>
-        <w:widowControl w:val="0"/>
-        <w:pBdr>
-          <w:top w:space="0" w:sz="0" w:val="nil"/>
-          <w:left w:space="0" w:sz="0" w:val="nil"/>
-          <w:bottom w:space="0" w:sz="0" w:val="nil"/>
-          <w:right w:space="0" w:sz="0" w:val="nil"/>
-          <w:between w:space="0" w:sz="0" w:val="nil"/>
-        </w:pBdr>
-        <w:shd w:fill="auto" w:val="clear"/>
-        <w:spacing w:after="0" w:before="258.8140869140625" w:line="248.15560340881348" w:lineRule="auto"/>
-        <w:ind w:left="2161.9200134277344" w:right="939.27490234375" w:hanging="341.0400390625"/>
-        <w:jc w:val="left"/>
-        <w:rPr>
-          <w:rFonts w:ascii="Times New Roman" w:cs="Times New Roman" w:eastAsia="Times New Roman" w:hAnsi="Times New Roman"/>
-          <w:b w:val="0"/>
-          <w:bCs w:val="0"/>
-          <w:i w:val="0"/>
-          <w:iCs w:val="0"/>
-          <w:smallCaps w:val="0"/>
-          <w:strike w:val="0"/>
-          <w:color w:val="000000"/>
-          <w:sz w:val="24"/>
-          <w:szCs w:val="24"/>
-          <w:u w:val="none"/>
-          <w:shd w:fill="auto" w:val="clear"/>
-          <w:vertAlign w:val="baseline"/>
-        </w:rPr>
-      </w:pPr>
-      <w:r>
-        <w:rPr>
-          <w:rFonts w:ascii="Arial" w:cs="Arial" w:eastAsia="Arial" w:hAnsi="Arial"/>
-          <w:b w:val="0"/>
-          <w:bCs w:val="0"/>
-          <w:i w:val="0"/>
-          <w:iCs w:val="0"/>
-          <w:smallCaps w:val="0"/>
-          <w:strike w:val="0"/>
-          <w:color w:val="000000"/>
-          <w:sz w:val="24"/>
-          <w:szCs w:val="24"/>
-          <w:u w:val="none"/>
-          <w:shd w:fill="auto" w:val="clear"/>
-          <w:vertAlign w:val="baseline"/>
-          <w:rtl w:val="0"/>
-        </w:rPr>
-        <w:t xml:space="preserve">● </w:t>
-      </w:r>
-      <w:r>
-        <w:rPr>
-          <w:rFonts w:ascii="Times New Roman" w:cs="Times New Roman" w:eastAsia="Times New Roman" w:hAnsi="Times New Roman"/>
-          <w:b w:val="0"/>
-          <w:bCs w:val="0"/>
-          <w:i w:val="0"/>
-          <w:iCs w:val="0"/>
-          <w:smallCaps w:val="0"/>
-          <w:strike w:val="0"/>
-          <w:color w:val="000000"/>
-          <w:sz w:val="24"/>
-          <w:szCs w:val="24"/>
-          <w:u w:val="none"/>
-          <w:shd w:fill="auto" w:val="clear"/>
-          <w:vertAlign w:val="baseline"/>
-          <w:rtl w:val="0"/>
-        </w:rPr>
-        <w:t xml:space="preserve">Melakukan pengukuran dan pemetaan topografi di lapangan untuk mendukung kegiatan perencanaan, operasional, dan reklamasi tambang. </w:t>
-      </w:r>
-    </w:p>
-    <w:p>
-      <w:pPr>
-        <w:keepNext w:val="0"/>
-        <w:keepLines w:val="0"/>
-        <w:pageBreakBefore w:val="0"/>
-        <w:widowControl w:val="0"/>
-        <w:pBdr>
-          <w:top w:space="0" w:sz="0" w:val="nil"/>
-          <w:left w:space="0" w:sz="0" w:val="nil"/>
-          <w:bottom w:space="0" w:sz="0" w:val="nil"/>
-          <w:right w:space="0" w:sz="0" w:val="nil"/>
-          <w:between w:space="0" w:sz="0" w:val="nil"/>
-        </w:pBdr>
-        <w:shd w:fill="auto" w:val="clear"/>
-        <w:spacing w:after="0" w:before="10.6390380859375" w:line="248.1591796875" w:lineRule="auto"/>
-        <w:ind w:left="2164.080047607422" w:right="309.844970703125" w:hanging="343.2000732421875"/>
-        <w:jc w:val="left"/>
-        <w:rPr>
-          <w:rFonts w:ascii="Times New Roman" w:cs="Times New Roman" w:eastAsia="Times New Roman" w:hAnsi="Times New Roman"/>
-          <w:b w:val="0"/>
-          <w:bCs w:val="0"/>
-          <w:i w:val="0"/>
-          <w:iCs w:val="0"/>
-          <w:smallCaps w:val="0"/>
-          <w:strike w:val="0"/>
-          <w:color w:val="000000"/>
-          <w:sz w:val="24"/>
-          <w:szCs w:val="24"/>
-          <w:u w:val="none"/>
-          <w:shd w:fill="auto" w:val="clear"/>
-          <w:vertAlign w:val="baseline"/>
-        </w:rPr>
-      </w:pPr>
-      <w:r>
-        <w:rPr>
-          <w:rFonts w:ascii="Arial" w:cs="Arial" w:eastAsia="Arial" w:hAnsi="Arial"/>
-          <w:b w:val="0"/>
-          <w:bCs w:val="0"/>
-          <w:i w:val="0"/>
-          <w:iCs w:val="0"/>
-          <w:smallCaps w:val="0"/>
-          <w:strike w:val="0"/>
-          <w:color w:val="000000"/>
-          <w:sz w:val="24"/>
-          <w:szCs w:val="24"/>
-          <w:u w:val="none"/>
-          <w:shd w:fill="auto" w:val="clear"/>
-          <w:vertAlign w:val="baseline"/>
-          <w:rtl w:val="0"/>
-        </w:rPr>
-        <w:t xml:space="preserve">● </w:t>
-      </w:r>
-      <w:r>
-        <w:rPr>
-          <w:rFonts w:ascii="Times New Roman" w:cs="Times New Roman" w:eastAsia="Times New Roman" w:hAnsi="Times New Roman"/>
-          <w:b w:val="0"/>
-          <w:bCs w:val="0"/>
-          <w:i w:val="0"/>
-          <w:iCs w:val="0"/>
-          <w:smallCaps w:val="0"/>
-          <w:strike w:val="0"/>
-          <w:color w:val="000000"/>
-          <w:sz w:val="24"/>
-          <w:szCs w:val="24"/>
-          <w:u w:val="none"/>
-          <w:shd w:fill="auto" w:val="clear"/>
-          <w:vertAlign w:val="baseline"/>
-          <w:rtl w:val="0"/>
-        </w:rPr>
-        <w:t xml:space="preserve">Mengoperasikan alat survei </w:t>
-      </w:r>
-      <w:r>
-        <w:rPr>
-          <w:rFonts w:ascii="Times New Roman" w:cs="Times New Roman" w:eastAsia="Times New Roman" w:hAnsi="Times New Roman"/>
-          <w:b w:val="1"/>
-          <w:bCs w:val="1"/>
-          <w:i w:val="0"/>
-          <w:iCs w:val="0"/>
-          <w:smallCaps w:val="0"/>
-          <w:strike w:val="0"/>
-          <w:color w:val="000000"/>
-          <w:sz w:val="24"/>
-          <w:szCs w:val="24"/>
-          <w:u w:val="none"/>
-          <w:shd w:fill="auto" w:val="clear"/>
-          <w:vertAlign w:val="baseline"/>
-          <w:rtl w:val="0"/>
-        </w:rPr>
-        <w:t xml:space="preserve">Total Station </w:t>
-      </w:r>
-      <w:r>
-        <w:rPr>
-          <w:rFonts w:ascii="Times New Roman" w:cs="Times New Roman" w:eastAsia="Times New Roman" w:hAnsi="Times New Roman"/>
-          <w:b w:val="0"/>
-          <w:bCs w:val="0"/>
-          <w:i w:val="0"/>
-          <w:iCs w:val="0"/>
-          <w:smallCaps w:val="0"/>
-          <w:strike w:val="0"/>
-          <w:color w:val="000000"/>
-          <w:sz w:val="24"/>
-          <w:szCs w:val="24"/>
-          <w:u w:val="none"/>
-          <w:shd w:fill="auto" w:val="clear"/>
-          <w:vertAlign w:val="baseline"/>
-          <w:rtl w:val="0"/>
-        </w:rPr>
-        <w:t xml:space="preserve">untuk pengambilan data titik kontrol, batas PIT, </w:t>
-      </w:r>
-      <w:r>
-        <w:rPr>
-          <w:rFonts w:ascii="Times New Roman" w:cs="Times New Roman" w:eastAsia="Times New Roman" w:hAnsi="Times New Roman"/>
-          <w:b w:val="0"/>
-          <w:bCs w:val="0"/>
-          <w:i w:val="1"/>
-          <w:iCs w:val="1"/>
-          <w:smallCaps w:val="0"/>
-          <w:strike w:val="0"/>
-          <w:color w:val="000000"/>
-          <w:sz w:val="24"/>
-          <w:szCs w:val="24"/>
-          <w:u w:val="none"/>
-          <w:shd w:fill="auto" w:val="clear"/>
-          <w:vertAlign w:val="baseline"/>
-          <w:rtl w:val="0"/>
-        </w:rPr>
-        <w:t xml:space="preserve">disposal area</w:t>
-      </w:r>
-      <w:r>
-        <w:rPr>
-          <w:rFonts w:ascii="Times New Roman" w:cs="Times New Roman" w:eastAsia="Times New Roman" w:hAnsi="Times New Roman"/>
-          <w:b w:val="0"/>
-          <w:bCs w:val="0"/>
-          <w:i w:val="0"/>
-          <w:iCs w:val="0"/>
-          <w:smallCaps w:val="0"/>
-          <w:strike w:val="0"/>
-          <w:color w:val="000000"/>
-          <w:sz w:val="24"/>
-          <w:szCs w:val="24"/>
-          <w:u w:val="none"/>
-          <w:shd w:fill="auto" w:val="clear"/>
-          <w:vertAlign w:val="baseline"/>
-          <w:rtl w:val="0"/>
-        </w:rPr>
-        <w:t xml:space="preserve">, dan </w:t>
-      </w:r>
-      <w:r>
-        <w:rPr>
-          <w:rFonts w:ascii="Times New Roman" w:cs="Times New Roman" w:eastAsia="Times New Roman" w:hAnsi="Times New Roman"/>
-          <w:b w:val="0"/>
-          <w:bCs w:val="0"/>
-          <w:i w:val="1"/>
-          <w:iCs w:val="1"/>
-          <w:smallCaps w:val="0"/>
-          <w:strike w:val="0"/>
-          <w:color w:val="000000"/>
-          <w:sz w:val="24"/>
-          <w:szCs w:val="24"/>
-          <w:u w:val="none"/>
-          <w:shd w:fill="auto" w:val="clear"/>
-          <w:vertAlign w:val="baseline"/>
-          <w:rtl w:val="0"/>
-        </w:rPr>
-        <w:t xml:space="preserve">stockpile </w:t>
-      </w:r>
-      <w:r>
-        <w:rPr>
-          <w:rFonts w:ascii="Times New Roman" w:cs="Times New Roman" w:eastAsia="Times New Roman" w:hAnsi="Times New Roman"/>
-          <w:b w:val="0"/>
-          <w:bCs w:val="0"/>
-          <w:i w:val="0"/>
-          <w:iCs w:val="0"/>
-          <w:smallCaps w:val="0"/>
-          <w:strike w:val="0"/>
-          <w:color w:val="000000"/>
-          <w:sz w:val="24"/>
-          <w:szCs w:val="24"/>
-          <w:u w:val="none"/>
-          <w:shd w:fill="auto" w:val="clear"/>
-          <w:vertAlign w:val="baseline"/>
-          <w:rtl w:val="0"/>
-        </w:rPr>
-        <w:t xml:space="preserve">secara akurat dan efisien. </w:t>
-      </w:r>
-    </w:p>
-    <w:p>
-      <w:pPr>
-        <w:keepNext w:val="0"/>
-        <w:keepLines w:val="0"/>
-        <w:pageBreakBefore w:val="0"/>
-        <w:widowControl w:val="0"/>
-        <w:pBdr>
-          <w:top w:space="0" w:sz="0" w:val="nil"/>
-          <w:left w:space="0" w:sz="0" w:val="nil"/>
-          <w:bottom w:space="0" w:sz="0" w:val="nil"/>
-          <w:right w:space="0" w:sz="0" w:val="nil"/>
-          <w:between w:space="0" w:sz="0" w:val="nil"/>
-        </w:pBdr>
-        <w:shd w:fill="auto" w:val="clear"/>
-        <w:spacing w:after="0" w:before="10.6304931640625" w:line="248.12255859375" w:lineRule="auto"/>
-        <w:ind w:left="2161.9200134277344" w:right="639.200439453125" w:hanging="341.0400390625"/>
-        <w:jc w:val="left"/>
-        <w:rPr>
-          <w:rFonts w:ascii="Times New Roman" w:cs="Times New Roman" w:eastAsia="Times New Roman" w:hAnsi="Times New Roman"/>
-          <w:b w:val="0"/>
-          <w:bCs w:val="0"/>
-          <w:i w:val="0"/>
-          <w:iCs w:val="0"/>
-          <w:smallCaps w:val="0"/>
-          <w:strike w:val="0"/>
-          <w:color w:val="000000"/>
-          <w:sz w:val="24"/>
-          <w:szCs w:val="24"/>
-          <w:u w:val="none"/>
-          <w:shd w:fill="auto" w:val="clear"/>
-          <w:vertAlign w:val="baseline"/>
-        </w:rPr>
-      </w:pPr>
-      <w:r>
-        <w:rPr>
-          <w:rFonts w:ascii="Arial" w:cs="Arial" w:eastAsia="Arial" w:hAnsi="Arial"/>
-          <w:b w:val="0"/>
-          <w:bCs w:val="0"/>
-          <w:i w:val="0"/>
-          <w:iCs w:val="0"/>
-          <w:smallCaps w:val="0"/>
-          <w:strike w:val="0"/>
-          <w:color w:val="000000"/>
-          <w:sz w:val="24"/>
-          <w:szCs w:val="24"/>
-          <w:u w:val="none"/>
-          <w:shd w:fill="auto" w:val="clear"/>
-          <w:vertAlign w:val="baseline"/>
-          <w:rtl w:val="0"/>
-        </w:rPr>
-        <w:t xml:space="preserve">● </w:t>
-      </w:r>
-      <w:r>
-        <w:rPr>
-          <w:rFonts w:ascii="Times New Roman" w:cs="Times New Roman" w:eastAsia="Times New Roman" w:hAnsi="Times New Roman"/>
-          <w:b w:val="0"/>
-          <w:bCs w:val="0"/>
-          <w:i w:val="0"/>
-          <w:iCs w:val="0"/>
-          <w:smallCaps w:val="0"/>
-          <w:strike w:val="0"/>
-          <w:color w:val="000000"/>
-          <w:sz w:val="24"/>
-          <w:szCs w:val="24"/>
-          <w:u w:val="none"/>
-          <w:shd w:fill="auto" w:val="clear"/>
-          <w:vertAlign w:val="baseline"/>
-          <w:rtl w:val="0"/>
-        </w:rPr>
-        <w:t xml:space="preserve">Memproses dan menganalisis data survei menggunakan </w:t>
-      </w:r>
-      <w:r>
-        <w:rPr>
-          <w:rFonts w:ascii="Times New Roman" w:cs="Times New Roman" w:eastAsia="Times New Roman" w:hAnsi="Times New Roman"/>
-          <w:b w:val="0"/>
-          <w:bCs w:val="0"/>
-          <w:i w:val="1"/>
-          <w:iCs w:val="1"/>
-          <w:smallCaps w:val="0"/>
-          <w:strike w:val="0"/>
-          <w:color w:val="000000"/>
-          <w:sz w:val="24"/>
-          <w:szCs w:val="24"/>
-          <w:u w:val="none"/>
-          <w:shd w:fill="auto" w:val="clear"/>
-          <w:vertAlign w:val="baseline"/>
-          <w:rtl w:val="0"/>
-        </w:rPr>
-        <w:t xml:space="preserve">software </w:t>
-      </w:r>
-      <w:r>
-        <w:rPr>
-          <w:rFonts w:ascii="Times New Roman" w:cs="Times New Roman" w:eastAsia="Times New Roman" w:hAnsi="Times New Roman"/>
-          <w:b w:val="1"/>
-          <w:bCs w:val="1"/>
-          <w:i w:val="0"/>
-          <w:iCs w:val="0"/>
-          <w:smallCaps w:val="0"/>
-          <w:strike w:val="0"/>
-          <w:color w:val="000000"/>
-          <w:sz w:val="24"/>
-          <w:szCs w:val="24"/>
-          <w:u w:val="none"/>
-          <w:shd w:fill="auto" w:val="clear"/>
-          <w:vertAlign w:val="baseline"/>
-          <w:rtl w:val="0"/>
-        </w:rPr>
-        <w:t xml:space="preserve">MineScape, Surpac, </w:t>
-      </w:r>
-      <w:r>
-        <w:rPr>
-          <w:rFonts w:ascii="Times New Roman" w:cs="Times New Roman" w:eastAsia="Times New Roman" w:hAnsi="Times New Roman"/>
-          <w:b w:val="0"/>
-          <w:bCs w:val="0"/>
-          <w:i w:val="0"/>
-          <w:iCs w:val="0"/>
-          <w:smallCaps w:val="0"/>
-          <w:strike w:val="0"/>
-          <w:color w:val="000000"/>
-          <w:sz w:val="24"/>
-          <w:szCs w:val="24"/>
-          <w:u w:val="none"/>
-          <w:shd w:fill="auto" w:val="clear"/>
-          <w:vertAlign w:val="baseline"/>
-          <w:rtl w:val="0"/>
-        </w:rPr>
-        <w:t xml:space="preserve">dan </w:t>
-      </w:r>
-      <w:r>
-        <w:rPr>
-          <w:rFonts w:ascii="Times New Roman" w:cs="Times New Roman" w:eastAsia="Times New Roman" w:hAnsi="Times New Roman"/>
-          <w:b w:val="1"/>
-          <w:bCs w:val="1"/>
-          <w:i w:val="0"/>
-          <w:iCs w:val="0"/>
-          <w:smallCaps w:val="0"/>
-          <w:strike w:val="0"/>
-          <w:color w:val="000000"/>
-          <w:sz w:val="24"/>
-          <w:szCs w:val="24"/>
-          <w:u w:val="none"/>
-          <w:shd w:fill="auto" w:val="clear"/>
-          <w:vertAlign w:val="baseline"/>
-          <w:rtl w:val="0"/>
-        </w:rPr>
-        <w:t xml:space="preserve">12D Model </w:t>
-      </w:r>
-      <w:r>
-        <w:rPr>
-          <w:rFonts w:ascii="Times New Roman" w:cs="Times New Roman" w:eastAsia="Times New Roman" w:hAnsi="Times New Roman"/>
-          <w:b w:val="0"/>
-          <w:bCs w:val="0"/>
-          <w:i w:val="0"/>
-          <w:iCs w:val="0"/>
-          <w:smallCaps w:val="0"/>
-          <w:strike w:val="0"/>
-          <w:color w:val="000000"/>
-          <w:sz w:val="24"/>
-          <w:szCs w:val="24"/>
-          <w:u w:val="none"/>
-          <w:shd w:fill="auto" w:val="clear"/>
-          <w:vertAlign w:val="baseline"/>
-          <w:rtl w:val="0"/>
-        </w:rPr>
-        <w:t xml:space="preserve">untuk membuat laporan kemajuan tambang, perhitungan volume (</w:t>
-      </w:r>
-      <w:r>
-        <w:rPr>
-          <w:rFonts w:ascii="Times New Roman" w:cs="Times New Roman" w:eastAsia="Times New Roman" w:hAnsi="Times New Roman"/>
-          <w:b w:val="0"/>
-          <w:bCs w:val="0"/>
-          <w:i w:val="1"/>
-          <w:iCs w:val="1"/>
-          <w:smallCaps w:val="0"/>
-          <w:strike w:val="0"/>
-          <w:color w:val="000000"/>
-          <w:sz w:val="24"/>
-          <w:szCs w:val="24"/>
-          <w:u w:val="none"/>
-          <w:shd w:fill="auto" w:val="clear"/>
-          <w:vertAlign w:val="baseline"/>
-          <w:rtl w:val="0"/>
-        </w:rPr>
-        <w:t xml:space="preserve">cut/fill</w:t>
-      </w:r>
-      <w:r>
-        <w:rPr>
-          <w:rFonts w:ascii="Times New Roman" w:cs="Times New Roman" w:eastAsia="Times New Roman" w:hAnsi="Times New Roman"/>
-          <w:b w:val="0"/>
-          <w:bCs w:val="0"/>
-          <w:i w:val="0"/>
-          <w:iCs w:val="0"/>
-          <w:smallCaps w:val="0"/>
-          <w:strike w:val="0"/>
-          <w:color w:val="000000"/>
-          <w:sz w:val="24"/>
-          <w:szCs w:val="24"/>
-          <w:u w:val="none"/>
-          <w:shd w:fill="auto" w:val="clear"/>
-          <w:vertAlign w:val="baseline"/>
-          <w:rtl w:val="0"/>
-        </w:rPr>
-        <w:t xml:space="preserve">), dan pemodelan 3D. </w:t>
-      </w:r>
-    </w:p>
-    <w:p>
-      <w:pPr>
-        <w:keepNext w:val="0"/>
-        <w:keepLines w:val="0"/>
-        <w:pageBreakBefore w:val="0"/>
-        <w:widowControl w:val="0"/>
-        <w:pBdr>
-          <w:top w:space="0" w:sz="0" w:val="nil"/>
-          <w:left w:space="0" w:sz="0" w:val="nil"/>
-          <w:bottom w:space="0" w:sz="0" w:val="nil"/>
-          <w:right w:space="0" w:sz="0" w:val="nil"/>
-          <w:between w:space="0" w:sz="0" w:val="nil"/>
-        </w:pBdr>
-        <w:shd w:fill="auto" w:val="clear"/>
-        <w:spacing w:after="0" w:before="10.6854248046875" w:line="248.1566333770752" w:lineRule="auto"/>
-        <w:ind w:left="2167.9200744628906" w:right="347.225341796875" w:hanging="347.04010009765625"/>
-        <w:jc w:val="left"/>
-        <w:rPr>
-          <w:rFonts w:ascii="Times New Roman" w:cs="Times New Roman" w:eastAsia="Times New Roman" w:hAnsi="Times New Roman"/>
-          <w:b w:val="0"/>
-          <w:bCs w:val="0"/>
-          <w:i w:val="0"/>
-          <w:iCs w:val="0"/>
-          <w:smallCaps w:val="0"/>
-          <w:strike w:val="0"/>
-          <w:color w:val="000000"/>
-          <w:sz w:val="24"/>
-          <w:szCs w:val="24"/>
-          <w:u w:val="none"/>
-          <w:shd w:fill="auto" w:val="clear"/>
-          <w:vertAlign w:val="baseline"/>
-        </w:rPr>
-      </w:pPr>
-      <w:r>
-        <w:rPr>
-          <w:rFonts w:ascii="Arial" w:cs="Arial" w:eastAsia="Arial" w:hAnsi="Arial"/>
-          <w:b w:val="0"/>
-          <w:bCs w:val="0"/>
-          <w:i w:val="0"/>
-          <w:iCs w:val="0"/>
-          <w:smallCaps w:val="0"/>
-          <w:strike w:val="0"/>
-          <w:color w:val="000000"/>
-          <w:sz w:val="24"/>
-          <w:szCs w:val="24"/>
-          <w:u w:val="none"/>
-          <w:shd w:fill="auto" w:val="clear"/>
-          <w:vertAlign w:val="baseline"/>
-          <w:rtl w:val="0"/>
-        </w:rPr>
-        <w:t xml:space="preserve">● </w:t>
-      </w:r>
-      <w:r>
-        <w:rPr>
-          <w:rFonts w:ascii="Times New Roman" w:cs="Times New Roman" w:eastAsia="Times New Roman" w:hAnsi="Times New Roman"/>
-          <w:b w:val="0"/>
-          <w:bCs w:val="0"/>
-          <w:i w:val="0"/>
-          <w:iCs w:val="0"/>
-          <w:smallCaps w:val="0"/>
-          <w:strike w:val="0"/>
-          <w:color w:val="000000"/>
-          <w:sz w:val="24"/>
-          <w:szCs w:val="24"/>
-          <w:u w:val="none"/>
-          <w:shd w:fill="auto" w:val="clear"/>
-          <w:vertAlign w:val="baseline"/>
-          <w:rtl w:val="0"/>
-        </w:rPr>
-        <w:t xml:space="preserve">Berkolaborasi secara efektif dengan tim </w:t>
-      </w:r>
-      <w:r>
-        <w:rPr>
-          <w:rFonts w:ascii="Times New Roman" w:cs="Times New Roman" w:eastAsia="Times New Roman" w:hAnsi="Times New Roman"/>
-          <w:b w:val="0"/>
-          <w:bCs w:val="0"/>
-          <w:i w:val="1"/>
-          <w:iCs w:val="1"/>
-          <w:smallCaps w:val="0"/>
-          <w:strike w:val="0"/>
-          <w:color w:val="000000"/>
-          <w:sz w:val="24"/>
-          <w:szCs w:val="24"/>
-          <w:u w:val="none"/>
-          <w:shd w:fill="auto" w:val="clear"/>
-          <w:vertAlign w:val="baseline"/>
-          <w:rtl w:val="0"/>
-        </w:rPr>
-        <w:t xml:space="preserve">engineering </w:t>
-      </w:r>
-      <w:r>
-        <w:rPr>
-          <w:rFonts w:ascii="Times New Roman" w:cs="Times New Roman" w:eastAsia="Times New Roman" w:hAnsi="Times New Roman"/>
-          <w:b w:val="0"/>
-          <w:bCs w:val="0"/>
-          <w:i w:val="0"/>
-          <w:iCs w:val="0"/>
-          <w:smallCaps w:val="0"/>
-          <w:strike w:val="0"/>
-          <w:color w:val="000000"/>
-          <w:sz w:val="24"/>
-          <w:szCs w:val="24"/>
-          <w:u w:val="none"/>
-          <w:shd w:fill="auto" w:val="clear"/>
-          <w:vertAlign w:val="baseline"/>
-          <w:rtl w:val="0"/>
-        </w:rPr>
-        <w:t xml:space="preserve">dan produksi untuk memastikan data survei sesuai dengan kebutuhan operasional di lapangan. </w:t>
-      </w:r>
-    </w:p>
-    <w:p>
-      <w:pPr>
-        <w:keepNext w:val="0"/>
-        <w:keepLines w:val="0"/>
-        <w:pageBreakBefore w:val="0"/>
-        <w:widowControl w:val="0"/>
-        <w:pBdr>
-          <w:top w:space="0" w:sz="0" w:val="nil"/>
-          <w:left w:space="0" w:sz="0" w:val="nil"/>
-          <w:bottom w:space="0" w:sz="0" w:val="nil"/>
-          <w:right w:space="0" w:sz="0" w:val="nil"/>
-          <w:between w:space="0" w:sz="0" w:val="nil"/>
-        </w:pBdr>
-        <w:shd w:fill="auto" w:val="clear"/>
-        <w:spacing w:after="0" w:before="10.635986328125" w:line="248.15711975097656" w:lineRule="auto"/>
-        <w:ind w:left="2162.4000549316406" w:right="485.9002685546875" w:hanging="341.52008056640625"/>
-        <w:jc w:val="left"/>
-        <w:rPr>
-          <w:rFonts w:ascii="Times New Roman" w:cs="Times New Roman" w:eastAsia="Times New Roman" w:hAnsi="Times New Roman"/>
-          <w:b w:val="0"/>
-          <w:bCs w:val="0"/>
-          <w:i w:val="0"/>
-          <w:iCs w:val="0"/>
-          <w:smallCaps w:val="0"/>
-          <w:strike w:val="0"/>
-          <w:color w:val="000000"/>
-          <w:sz w:val="24"/>
-          <w:szCs w:val="24"/>
-          <w:u w:val="none"/>
-          <w:shd w:fill="auto" w:val="clear"/>
-          <w:vertAlign w:val="baseline"/>
-        </w:rPr>
-      </w:pPr>
-      <w:r>
-        <w:rPr>
-          <w:rFonts w:ascii="Arial" w:cs="Arial" w:eastAsia="Arial" w:hAnsi="Arial"/>
-          <w:b w:val="0"/>
-          <w:bCs w:val="0"/>
-          <w:i w:val="0"/>
-          <w:iCs w:val="0"/>
-          <w:smallCaps w:val="0"/>
-          <w:strike w:val="0"/>
-          <w:color w:val="000000"/>
-          <w:sz w:val="24"/>
-          <w:szCs w:val="24"/>
-          <w:u w:val="none"/>
-          <w:shd w:fill="auto" w:val="clear"/>
-          <w:vertAlign w:val="baseline"/>
-          <w:rtl w:val="0"/>
-        </w:rPr>
-        <w:t xml:space="preserve">● </w:t>
-      </w:r>
-      <w:r>
-        <w:rPr>
-          <w:rFonts w:ascii="Times New Roman" w:cs="Times New Roman" w:eastAsia="Times New Roman" w:hAnsi="Times New Roman"/>
-          <w:b w:val="0"/>
-          <w:bCs w:val="0"/>
-          <w:i w:val="0"/>
-          <w:iCs w:val="0"/>
-          <w:smallCaps w:val="0"/>
-          <w:strike w:val="0"/>
-          <w:color w:val="000000"/>
-          <w:sz w:val="24"/>
-          <w:szCs w:val="24"/>
-          <w:u w:val="none"/>
-          <w:shd w:fill="auto" w:val="clear"/>
-          <w:vertAlign w:val="baseline"/>
-          <w:rtl w:val="0"/>
-        </w:rPr>
-        <w:t xml:space="preserve">Menyiapkan laporan harian dan mingguan mengenai aktivitas dan hasil survei yang telah dilakukan. </w:t>
-      </w:r>
-    </w:p>
-    <w:p>
-      <w:pPr>
-        <w:keepNext w:val="0"/>
-        <w:keepLines w:val="0"/>
-        <w:pageBreakBefore w:val="0"/>
-        <w:widowControl w:val="0"/>
-        <w:pBdr>
-          <w:top w:space="0" w:sz="0" w:val="nil"/>
-          <w:left w:space="0" w:sz="0" w:val="nil"/>
-          <w:bottom w:space="0" w:sz="0" w:val="nil"/>
-          <w:right w:space="0" w:sz="0" w:val="nil"/>
-          <w:between w:space="0" w:sz="0" w:val="nil"/>
-        </w:pBdr>
-        <w:shd w:fill="auto" w:val="clear"/>
-        <w:spacing w:after="0" w:before="10.635986328125" w:line="248.15711975097656" w:lineRule="auto"/>
-        <w:ind w:left="2162.4000549316406" w:right="485.9002685546875" w:hanging="341.52008056640625"/>
-        <w:jc w:val="left"/>
-        <w:rPr>
-          <w:rFonts w:ascii="Times New Roman" w:cs="Times New Roman" w:eastAsia="Times New Roman" w:hAnsi="Times New Roman"/>
-          <w:sz w:val="24"/>
-          <w:szCs w:val="24"/>
-        </w:rPr>
-      </w:pPr>
-      <w:r>
-        <w:rPr>
-          <w:rtl w:val="0"/>
-        </w:rPr>
+          <w:i/>
+        </w:rPr>
+        <w:t>Juli 2026 – September 2026</w:t>
+      </w:r>
+    </w:p>
+    <w:p/>
+    <w:p>
+      <w:r>
+        <w:rPr>
+          <w:b/>
+        </w:rPr>
+        <w:t>Pendataan Lapangan:</w:t>
+      </w:r>
+      <w:r>
+        <w:rPr/>
+        <w:t xml:space="preserve"> Melakukan pengumpulan data survei-survei BPS dengan mewawancarai responden secara langsung di wilayah Kabupaten Lahat.</w:t>
+      </w:r>
+    </w:p>
+    <w:p>
+      <w:r>
+        <w:rPr>
+          <w:b/>
+        </w:rPr>
+        <w:t>Akurasi Data:</w:t>
+      </w:r>
+      <w:r>
+        <w:rPr/>
+        <w:t xml:space="preserve"> Memastikan kelengkapan dan kebenaran data sesuai pedoman serta definisi operasional BPS, dan menyelesaikan target pendataan dalam tenggat waktu yang ditetapkan.</w:t>
+      </w:r>
+    </w:p>
+    <w:p>
+      <w:r>
+        <w:rPr>
+          <w:b/>
+        </w:rPr>
+        <w:t>Koordinasi:</w:t>
+      </w:r>
+      <w:r>
+        <w:rPr/>
+        <w:t xml:space="preserve"> Berkoordinasi dengan koordinator lapangan BPS untuk validasi data dan penyelesaian kendala selama kegiatan pendataan.</w:t>
       </w:r>
     </w:p>
     <w:p>
@@ -1609,7 +846,7 @@
           <w:szCs w:val="24"/>
           <w:rtl w:val="0"/>
         </w:rPr>
-        <w:t xml:space="preserve">Februari 2026 -         April 2026</w:t>
+        <w:t>Februari 2026 – April 2026</w:t>
       </w:r>
     </w:p>
     <w:p>
@@ -1895,71 +1132,834 @@
       </w:r>
     </w:p>
     <w:p>
-      <w:r>
-        <w:rPr>
-          <w:b/>
-        </w:rPr>
-        <w:t xml:space="preserve"> </w:t>
-        <w:tab/>
-        <w:tab/>
-        <w:t>Mitra Statistik</w:t>
-      </w:r>
-    </w:p>
-    <w:p/>
-    <w:p>
-      <w:r>
-        <w:rPr>
-          <w:b/>
-        </w:rPr>
-        <w:tab/>
-        <w:t xml:space="preserve">BPS Kabupaten Lahat </w:t>
-      </w:r>
-      <w:r>
-        <w:rPr/>
+      <w:pPr>
+        <w:keepNext w:val="0"/>
+        <w:keepLines w:val="0"/>
+        <w:pageBreakBefore w:val="0"/>
+        <w:widowControl w:val="0"/>
+        <w:pBdr>
+          <w:top w:space="0" w:sz="0" w:val="nil"/>
+          <w:left w:space="0" w:sz="0" w:val="nil"/>
+          <w:bottom w:space="0" w:sz="0" w:val="nil"/>
+          <w:right w:space="0" w:sz="0" w:val="nil"/>
+          <w:between w:space="0" w:sz="0" w:val="nil"/>
+        </w:pBdr>
+        <w:shd w:fill="auto" w:val="clear"/>
+        <w:spacing w:after="0" w:before="288.3184814453125" w:line="240" w:lineRule="auto"/>
+        <w:ind w:left="1446.4999389648438" w:right="0" w:firstLine="0"/>
+        <w:jc w:val="left"/>
+        <w:rPr>
+          <w:rFonts w:ascii="Times New Roman" w:cs="Times New Roman" w:eastAsia="Times New Roman" w:hAnsi="Times New Roman"/>
+          <w:b w:val="1"/>
+          <w:bCs w:val="1"/>
+          <w:i w:val="0"/>
+          <w:iCs w:val="0"/>
+          <w:smallCaps w:val="0"/>
+          <w:strike w:val="0"/>
+          <w:color w:val="000000"/>
+          <w:sz w:val="24"/>
+          <w:szCs w:val="24"/>
+          <w:u w:val="none"/>
+          <w:shd w:fill="auto" w:val="clear"/>
+          <w:vertAlign w:val="baseline"/>
+        </w:rPr>
+      </w:pPr>
+      <w:r>
+        <w:rPr>
+          <w:rFonts w:ascii="Times New Roman" w:cs="Times New Roman" w:eastAsia="Times New Roman" w:hAnsi="Times New Roman"/>
+          <w:b w:val="1"/>
+          <w:bCs w:val="1"/>
+          <w:sz w:val="24"/>
+          <w:szCs w:val="24"/>
+          <w:rtl w:val="0"/>
+        </w:rPr>
+        <w:t xml:space="preserve">Assistant Survey</w:t>
+      </w:r>
+      <w:r>
+        <w:rPr>
+          <w:rtl w:val="0"/>
+        </w:rPr>
+      </w:r>
+    </w:p>
+    <w:p>
+      <w:pPr>
+        <w:keepNext w:val="0"/>
+        <w:keepLines w:val="0"/>
+        <w:pageBreakBefore w:val="0"/>
+        <w:widowControl w:val="0"/>
+        <w:pBdr>
+          <w:top w:space="0" w:sz="0" w:val="nil"/>
+          <w:left w:space="0" w:sz="0" w:val="nil"/>
+          <w:bottom w:space="0" w:sz="0" w:val="nil"/>
+          <w:right w:space="0" w:sz="0" w:val="nil"/>
+          <w:between w:space="0" w:sz="0" w:val="nil"/>
+        </w:pBdr>
+        <w:shd w:fill="auto" w:val="clear"/>
+        <w:spacing w:after="0" w:before="288.3184814453125" w:line="240" w:lineRule="auto"/>
+        <w:ind w:left="1446.4999389648438" w:right="0" w:firstLine="0"/>
+        <w:jc w:val="left"/>
+        <w:rPr>
+          <w:rFonts w:ascii="Times New Roman" w:cs="Times New Roman" w:eastAsia="Times New Roman" w:hAnsi="Times New Roman"/>
+          <w:b w:val="0"/>
+          <w:bCs w:val="0"/>
+          <w:i w:val="1"/>
+          <w:iCs w:val="1"/>
+          <w:smallCaps w:val="0"/>
+          <w:strike w:val="0"/>
+          <w:color w:val="000000"/>
+          <w:sz w:val="24"/>
+          <w:szCs w:val="24"/>
+          <w:u w:val="none"/>
+          <w:shd w:fill="auto" w:val="clear"/>
+          <w:vertAlign w:val="baseline"/>
+        </w:rPr>
+      </w:pPr>
+      <w:r>
+        <w:rPr>
+          <w:rFonts w:ascii="Times New Roman" w:cs="Times New Roman" w:eastAsia="Times New Roman" w:hAnsi="Times New Roman"/>
+          <w:b w:val="1"/>
+          <w:bCs w:val="1"/>
+          <w:i w:val="0"/>
+          <w:iCs w:val="0"/>
+          <w:smallCaps w:val="0"/>
+          <w:strike w:val="0"/>
+          <w:color w:val="000000"/>
+          <w:sz w:val="24"/>
+          <w:szCs w:val="24"/>
+          <w:u w:val="none"/>
+          <w:shd w:fill="auto" w:val="clear"/>
+          <w:vertAlign w:val="baseline"/>
+          <w:rtl w:val="0"/>
+        </w:rPr>
+        <w:t xml:space="preserve">PT. Anugrah Bumi Lestari </w:t>
+      </w:r>
+      <w:r>
+        <w:rPr>
+          <w:rFonts w:ascii="Times New Roman" w:cs="Times New Roman" w:eastAsia="Times New Roman" w:hAnsi="Times New Roman"/>
+          <w:b w:val="0"/>
+          <w:bCs w:val="0"/>
+          <w:i w:val="0"/>
+          <w:iCs w:val="0"/>
+          <w:smallCaps w:val="0"/>
+          <w:strike w:val="0"/>
+          <w:color w:val="000000"/>
+          <w:sz w:val="24"/>
+          <w:szCs w:val="24"/>
+          <w:u w:val="none"/>
+          <w:shd w:fill="auto" w:val="clear"/>
+          <w:vertAlign w:val="baseline"/>
+          <w:rtl w:val="0"/>
+        </w:rPr>
         <w:t xml:space="preserve">| Lahat, Sumatra Selatan </w:t>
       </w:r>
       <w:r>
         <w:rPr>
-          <w:i/>
-        </w:rPr>
-        <w:t>Juli 2026 – September 2026</w:t>
-      </w:r>
-    </w:p>
-    <w:p/>
-    <w:p>
-      <w:r>
-        <w:rPr>
-          <w:b/>
-        </w:rPr>
-        <w:t>Pendataan Lapangan:</w:t>
-      </w:r>
-      <w:r>
-        <w:rPr/>
-        <w:t xml:space="preserve"> Melakukan pengumpulan data survei-survei BPS dengan mewawancarai responden secara langsung di wilayah Kabupaten Lahat.</w:t>
-      </w:r>
-    </w:p>
-    <w:p>
-      <w:r>
-        <w:rPr>
-          <w:b/>
-        </w:rPr>
-        <w:t>Akurasi Data:</w:t>
-      </w:r>
-      <w:r>
-        <w:rPr/>
-        <w:t xml:space="preserve"> Memastikan kelengkapan dan kebenaran data sesuai pedoman serta definisi operasional BPS, dan menyelesaikan target pendataan dalam tenggat waktu yang ditetapkan.</w:t>
-      </w:r>
-    </w:p>
-    <w:p>
-      <w:r>
-        <w:rPr>
-          <w:b/>
-        </w:rPr>
-        <w:t>Koordinasi:</w:t>
-      </w:r>
-      <w:r>
-        <w:rPr/>
-        <w:t xml:space="preserve"> Berkoordinasi dengan koordinator lapangan BPS untuk validasi data dan penyelesaian kendala selama kegiatan pendataan.</w:t>
+          <w:rFonts w:ascii="Times New Roman" w:cs="Times New Roman" w:eastAsia="Times New Roman" w:hAnsi="Times New Roman"/>
+          <w:b w:val="0"/>
+          <w:bCs w:val="0"/>
+          <w:i w:val="1"/>
+          <w:iCs w:val="1"/>
+          <w:smallCaps w:val="0"/>
+          <w:strike w:val="0"/>
+          <w:color w:val="000000"/>
+          <w:sz w:val="24"/>
+          <w:szCs w:val="24"/>
+          <w:u w:val="none"/>
+          <w:shd w:fill="auto" w:val="clear"/>
+          <w:vertAlign w:val="baseline"/>
+          <w:rtl w:val="0"/>
+        </w:rPr>
+        <w:t xml:space="preserve">Mei 2023 – </w:t>
+      </w:r>
+      <w:r>
+        <w:rPr>
+          <w:rFonts w:ascii="Times New Roman" w:cs="Times New Roman" w:eastAsia="Times New Roman" w:hAnsi="Times New Roman"/>
+          <w:i w:val="1"/>
+          <w:iCs w:val="1"/>
+          <w:sz w:val="24"/>
+          <w:szCs w:val="24"/>
+          <w:rtl w:val="0"/>
+        </w:rPr>
+        <w:t xml:space="preserve">Oktober 2025</w:t>
+      </w:r>
+      <w:r>
+        <w:rPr>
+          <w:rtl w:val="0"/>
+        </w:rPr>
+      </w:r>
+    </w:p>
+    <w:p>
+      <w:pPr>
+        <w:keepNext w:val="0"/>
+        <w:keepLines w:val="0"/>
+        <w:pageBreakBefore w:val="0"/>
+        <w:widowControl w:val="0"/>
+        <w:pBdr>
+          <w:top w:space="0" w:sz="0" w:val="nil"/>
+          <w:left w:space="0" w:sz="0" w:val="nil"/>
+          <w:bottom w:space="0" w:sz="0" w:val="nil"/>
+          <w:right w:space="0" w:sz="0" w:val="nil"/>
+          <w:between w:space="0" w:sz="0" w:val="nil"/>
+        </w:pBdr>
+        <w:shd w:fill="auto" w:val="clear"/>
+        <w:spacing w:after="0" w:before="258.8140869140625" w:line="248.15560340881348" w:lineRule="auto"/>
+        <w:ind w:left="2161.9200134277344" w:right="939.27490234375" w:hanging="341.0400390625"/>
+        <w:jc w:val="left"/>
+        <w:rPr>
+          <w:rFonts w:ascii="Times New Roman" w:cs="Times New Roman" w:eastAsia="Times New Roman" w:hAnsi="Times New Roman"/>
+          <w:b w:val="0"/>
+          <w:bCs w:val="0"/>
+          <w:i w:val="0"/>
+          <w:iCs w:val="0"/>
+          <w:smallCaps w:val="0"/>
+          <w:strike w:val="0"/>
+          <w:color w:val="000000"/>
+          <w:sz w:val="24"/>
+          <w:szCs w:val="24"/>
+          <w:u w:val="none"/>
+          <w:shd w:fill="auto" w:val="clear"/>
+          <w:vertAlign w:val="baseline"/>
+        </w:rPr>
+      </w:pPr>
+      <w:r>
+        <w:rPr>
+          <w:rFonts w:ascii="Arial" w:cs="Arial" w:eastAsia="Arial" w:hAnsi="Arial"/>
+          <w:b w:val="0"/>
+          <w:bCs w:val="0"/>
+          <w:i w:val="0"/>
+          <w:iCs w:val="0"/>
+          <w:smallCaps w:val="0"/>
+          <w:strike w:val="0"/>
+          <w:color w:val="000000"/>
+          <w:sz w:val="24"/>
+          <w:szCs w:val="24"/>
+          <w:u w:val="none"/>
+          <w:shd w:fill="auto" w:val="clear"/>
+          <w:vertAlign w:val="baseline"/>
+          <w:rtl w:val="0"/>
+        </w:rPr>
+        <w:t xml:space="preserve">● </w:t>
+      </w:r>
+      <w:r>
+        <w:rPr>
+          <w:rFonts w:ascii="Times New Roman" w:cs="Times New Roman" w:eastAsia="Times New Roman" w:hAnsi="Times New Roman"/>
+          <w:b w:val="0"/>
+          <w:bCs w:val="0"/>
+          <w:i w:val="0"/>
+          <w:iCs w:val="0"/>
+          <w:smallCaps w:val="0"/>
+          <w:strike w:val="0"/>
+          <w:color w:val="000000"/>
+          <w:sz w:val="24"/>
+          <w:szCs w:val="24"/>
+          <w:u w:val="none"/>
+          <w:shd w:fill="auto" w:val="clear"/>
+          <w:vertAlign w:val="baseline"/>
+          <w:rtl w:val="0"/>
+        </w:rPr>
+        <w:t xml:space="preserve">Melakukan pengukuran dan pemetaan topografi di lapangan untuk mendukung kegiatan perencanaan, operasional, dan reklamasi tambang. </w:t>
+      </w:r>
+    </w:p>
+    <w:p>
+      <w:pPr>
+        <w:keepNext w:val="0"/>
+        <w:keepLines w:val="0"/>
+        <w:pageBreakBefore w:val="0"/>
+        <w:widowControl w:val="0"/>
+        <w:pBdr>
+          <w:top w:space="0" w:sz="0" w:val="nil"/>
+          <w:left w:space="0" w:sz="0" w:val="nil"/>
+          <w:bottom w:space="0" w:sz="0" w:val="nil"/>
+          <w:right w:space="0" w:sz="0" w:val="nil"/>
+          <w:between w:space="0" w:sz="0" w:val="nil"/>
+        </w:pBdr>
+        <w:shd w:fill="auto" w:val="clear"/>
+        <w:spacing w:after="0" w:before="10.6390380859375" w:line="248.1591796875" w:lineRule="auto"/>
+        <w:ind w:left="2164.080047607422" w:right="309.844970703125" w:hanging="343.2000732421875"/>
+        <w:jc w:val="left"/>
+        <w:rPr>
+          <w:rFonts w:ascii="Times New Roman" w:cs="Times New Roman" w:eastAsia="Times New Roman" w:hAnsi="Times New Roman"/>
+          <w:b w:val="0"/>
+          <w:bCs w:val="0"/>
+          <w:i w:val="0"/>
+          <w:iCs w:val="0"/>
+          <w:smallCaps w:val="0"/>
+          <w:strike w:val="0"/>
+          <w:color w:val="000000"/>
+          <w:sz w:val="24"/>
+          <w:szCs w:val="24"/>
+          <w:u w:val="none"/>
+          <w:shd w:fill="auto" w:val="clear"/>
+          <w:vertAlign w:val="baseline"/>
+        </w:rPr>
+      </w:pPr>
+      <w:r>
+        <w:rPr>
+          <w:rFonts w:ascii="Arial" w:cs="Arial" w:eastAsia="Arial" w:hAnsi="Arial"/>
+          <w:b w:val="0"/>
+          <w:bCs w:val="0"/>
+          <w:i w:val="0"/>
+          <w:iCs w:val="0"/>
+          <w:smallCaps w:val="0"/>
+          <w:strike w:val="0"/>
+          <w:color w:val="000000"/>
+          <w:sz w:val="24"/>
+          <w:szCs w:val="24"/>
+          <w:u w:val="none"/>
+          <w:shd w:fill="auto" w:val="clear"/>
+          <w:vertAlign w:val="baseline"/>
+          <w:rtl w:val="0"/>
+        </w:rPr>
+        <w:t xml:space="preserve">● </w:t>
+      </w:r>
+      <w:r>
+        <w:rPr>
+          <w:rFonts w:ascii="Times New Roman" w:cs="Times New Roman" w:eastAsia="Times New Roman" w:hAnsi="Times New Roman"/>
+          <w:b w:val="0"/>
+          <w:bCs w:val="0"/>
+          <w:i w:val="0"/>
+          <w:iCs w:val="0"/>
+          <w:smallCaps w:val="0"/>
+          <w:strike w:val="0"/>
+          <w:color w:val="000000"/>
+          <w:sz w:val="24"/>
+          <w:szCs w:val="24"/>
+          <w:u w:val="none"/>
+          <w:shd w:fill="auto" w:val="clear"/>
+          <w:vertAlign w:val="baseline"/>
+          <w:rtl w:val="0"/>
+        </w:rPr>
+        <w:t xml:space="preserve">Mengoperasikan alat survei </w:t>
+      </w:r>
+      <w:r>
+        <w:rPr>
+          <w:rFonts w:ascii="Times New Roman" w:cs="Times New Roman" w:eastAsia="Times New Roman" w:hAnsi="Times New Roman"/>
+          <w:b w:val="1"/>
+          <w:bCs w:val="1"/>
+          <w:i w:val="0"/>
+          <w:iCs w:val="0"/>
+          <w:smallCaps w:val="0"/>
+          <w:strike w:val="0"/>
+          <w:color w:val="000000"/>
+          <w:sz w:val="24"/>
+          <w:szCs w:val="24"/>
+          <w:u w:val="none"/>
+          <w:shd w:fill="auto" w:val="clear"/>
+          <w:vertAlign w:val="baseline"/>
+          <w:rtl w:val="0"/>
+        </w:rPr>
+        <w:t xml:space="preserve">Total Station </w:t>
+      </w:r>
+      <w:r>
+        <w:rPr>
+          <w:rFonts w:ascii="Times New Roman" w:cs="Times New Roman" w:eastAsia="Times New Roman" w:hAnsi="Times New Roman"/>
+          <w:b w:val="0"/>
+          <w:bCs w:val="0"/>
+          <w:i w:val="0"/>
+          <w:iCs w:val="0"/>
+          <w:smallCaps w:val="0"/>
+          <w:strike w:val="0"/>
+          <w:color w:val="000000"/>
+          <w:sz w:val="24"/>
+          <w:szCs w:val="24"/>
+          <w:u w:val="none"/>
+          <w:shd w:fill="auto" w:val="clear"/>
+          <w:vertAlign w:val="baseline"/>
+          <w:rtl w:val="0"/>
+        </w:rPr>
+        <w:t xml:space="preserve">untuk pengambilan data titik kontrol, batas PIT, </w:t>
+      </w:r>
+      <w:r>
+        <w:rPr>
+          <w:rFonts w:ascii="Times New Roman" w:cs="Times New Roman" w:eastAsia="Times New Roman" w:hAnsi="Times New Roman"/>
+          <w:b w:val="0"/>
+          <w:bCs w:val="0"/>
+          <w:i w:val="1"/>
+          <w:iCs w:val="1"/>
+          <w:smallCaps w:val="0"/>
+          <w:strike w:val="0"/>
+          <w:color w:val="000000"/>
+          <w:sz w:val="24"/>
+          <w:szCs w:val="24"/>
+          <w:u w:val="none"/>
+          <w:shd w:fill="auto" w:val="clear"/>
+          <w:vertAlign w:val="baseline"/>
+          <w:rtl w:val="0"/>
+        </w:rPr>
+        <w:t xml:space="preserve">disposal area</w:t>
+      </w:r>
+      <w:r>
+        <w:rPr>
+          <w:rFonts w:ascii="Times New Roman" w:cs="Times New Roman" w:eastAsia="Times New Roman" w:hAnsi="Times New Roman"/>
+          <w:b w:val="0"/>
+          <w:bCs w:val="0"/>
+          <w:i w:val="0"/>
+          <w:iCs w:val="0"/>
+          <w:smallCaps w:val="0"/>
+          <w:strike w:val="0"/>
+          <w:color w:val="000000"/>
+          <w:sz w:val="24"/>
+          <w:szCs w:val="24"/>
+          <w:u w:val="none"/>
+          <w:shd w:fill="auto" w:val="clear"/>
+          <w:vertAlign w:val="baseline"/>
+          <w:rtl w:val="0"/>
+        </w:rPr>
+        <w:t xml:space="preserve">, dan </w:t>
+      </w:r>
+      <w:r>
+        <w:rPr>
+          <w:rFonts w:ascii="Times New Roman" w:cs="Times New Roman" w:eastAsia="Times New Roman" w:hAnsi="Times New Roman"/>
+          <w:b w:val="0"/>
+          <w:bCs w:val="0"/>
+          <w:i w:val="1"/>
+          <w:iCs w:val="1"/>
+          <w:smallCaps w:val="0"/>
+          <w:strike w:val="0"/>
+          <w:color w:val="000000"/>
+          <w:sz w:val="24"/>
+          <w:szCs w:val="24"/>
+          <w:u w:val="none"/>
+          <w:shd w:fill="auto" w:val="clear"/>
+          <w:vertAlign w:val="baseline"/>
+          <w:rtl w:val="0"/>
+        </w:rPr>
+        <w:t xml:space="preserve">stockpile </w:t>
+      </w:r>
+      <w:r>
+        <w:rPr>
+          <w:rFonts w:ascii="Times New Roman" w:cs="Times New Roman" w:eastAsia="Times New Roman" w:hAnsi="Times New Roman"/>
+          <w:b w:val="0"/>
+          <w:bCs w:val="0"/>
+          <w:i w:val="0"/>
+          <w:iCs w:val="0"/>
+          <w:smallCaps w:val="0"/>
+          <w:strike w:val="0"/>
+          <w:color w:val="000000"/>
+          <w:sz w:val="24"/>
+          <w:szCs w:val="24"/>
+          <w:u w:val="none"/>
+          <w:shd w:fill="auto" w:val="clear"/>
+          <w:vertAlign w:val="baseline"/>
+          <w:rtl w:val="0"/>
+        </w:rPr>
+        <w:t xml:space="preserve">secara akurat dan efisien. </w:t>
+      </w:r>
+    </w:p>
+    <w:p>
+      <w:pPr>
+        <w:keepNext w:val="0"/>
+        <w:keepLines w:val="0"/>
+        <w:pageBreakBefore w:val="0"/>
+        <w:widowControl w:val="0"/>
+        <w:pBdr>
+          <w:top w:space="0" w:sz="0" w:val="nil"/>
+          <w:left w:space="0" w:sz="0" w:val="nil"/>
+          <w:bottom w:space="0" w:sz="0" w:val="nil"/>
+          <w:right w:space="0" w:sz="0" w:val="nil"/>
+          <w:between w:space="0" w:sz="0" w:val="nil"/>
+        </w:pBdr>
+        <w:shd w:fill="auto" w:val="clear"/>
+        <w:spacing w:after="0" w:before="10.6304931640625" w:line="248.12255859375" w:lineRule="auto"/>
+        <w:ind w:left="2161.9200134277344" w:right="639.200439453125" w:hanging="341.0400390625"/>
+        <w:jc w:val="left"/>
+        <w:rPr>
+          <w:rFonts w:ascii="Times New Roman" w:cs="Times New Roman" w:eastAsia="Times New Roman" w:hAnsi="Times New Roman"/>
+          <w:b w:val="0"/>
+          <w:bCs w:val="0"/>
+          <w:i w:val="0"/>
+          <w:iCs w:val="0"/>
+          <w:smallCaps w:val="0"/>
+          <w:strike w:val="0"/>
+          <w:color w:val="000000"/>
+          <w:sz w:val="24"/>
+          <w:szCs w:val="24"/>
+          <w:u w:val="none"/>
+          <w:shd w:fill="auto" w:val="clear"/>
+          <w:vertAlign w:val="baseline"/>
+        </w:rPr>
+      </w:pPr>
+      <w:r>
+        <w:rPr>
+          <w:rFonts w:ascii="Arial" w:cs="Arial" w:eastAsia="Arial" w:hAnsi="Arial"/>
+          <w:b w:val="0"/>
+          <w:bCs w:val="0"/>
+          <w:i w:val="0"/>
+          <w:iCs w:val="0"/>
+          <w:smallCaps w:val="0"/>
+          <w:strike w:val="0"/>
+          <w:color w:val="000000"/>
+          <w:sz w:val="24"/>
+          <w:szCs w:val="24"/>
+          <w:u w:val="none"/>
+          <w:shd w:fill="auto" w:val="clear"/>
+          <w:vertAlign w:val="baseline"/>
+          <w:rtl w:val="0"/>
+        </w:rPr>
+        <w:t xml:space="preserve">● </w:t>
+      </w:r>
+      <w:r>
+        <w:rPr>
+          <w:rFonts w:ascii="Times New Roman" w:cs="Times New Roman" w:eastAsia="Times New Roman" w:hAnsi="Times New Roman"/>
+          <w:b w:val="0"/>
+          <w:bCs w:val="0"/>
+          <w:i w:val="0"/>
+          <w:iCs w:val="0"/>
+          <w:smallCaps w:val="0"/>
+          <w:strike w:val="0"/>
+          <w:color w:val="000000"/>
+          <w:sz w:val="24"/>
+          <w:szCs w:val="24"/>
+          <w:u w:val="none"/>
+          <w:shd w:fill="auto" w:val="clear"/>
+          <w:vertAlign w:val="baseline"/>
+          <w:rtl w:val="0"/>
+        </w:rPr>
+        <w:t xml:space="preserve">Memproses dan menganalisis data survei menggunakan </w:t>
+      </w:r>
+      <w:r>
+        <w:rPr>
+          <w:rFonts w:ascii="Times New Roman" w:cs="Times New Roman" w:eastAsia="Times New Roman" w:hAnsi="Times New Roman"/>
+          <w:b w:val="0"/>
+          <w:bCs w:val="0"/>
+          <w:i w:val="1"/>
+          <w:iCs w:val="1"/>
+          <w:smallCaps w:val="0"/>
+          <w:strike w:val="0"/>
+          <w:color w:val="000000"/>
+          <w:sz w:val="24"/>
+          <w:szCs w:val="24"/>
+          <w:u w:val="none"/>
+          <w:shd w:fill="auto" w:val="clear"/>
+          <w:vertAlign w:val="baseline"/>
+          <w:rtl w:val="0"/>
+        </w:rPr>
+        <w:t xml:space="preserve">software </w:t>
+      </w:r>
+      <w:r>
+        <w:rPr>
+          <w:rFonts w:ascii="Times New Roman" w:cs="Times New Roman" w:eastAsia="Times New Roman" w:hAnsi="Times New Roman"/>
+          <w:b w:val="1"/>
+          <w:bCs w:val="1"/>
+          <w:i w:val="0"/>
+          <w:iCs w:val="0"/>
+          <w:smallCaps w:val="0"/>
+          <w:strike w:val="0"/>
+          <w:color w:val="000000"/>
+          <w:sz w:val="24"/>
+          <w:szCs w:val="24"/>
+          <w:u w:val="none"/>
+          <w:shd w:fill="auto" w:val="clear"/>
+          <w:vertAlign w:val="baseline"/>
+          <w:rtl w:val="0"/>
+        </w:rPr>
+        <w:t xml:space="preserve">MineScape, Surpac, </w:t>
+      </w:r>
+      <w:r>
+        <w:rPr>
+          <w:rFonts w:ascii="Times New Roman" w:cs="Times New Roman" w:eastAsia="Times New Roman" w:hAnsi="Times New Roman"/>
+          <w:b w:val="0"/>
+          <w:bCs w:val="0"/>
+          <w:i w:val="0"/>
+          <w:iCs w:val="0"/>
+          <w:smallCaps w:val="0"/>
+          <w:strike w:val="0"/>
+          <w:color w:val="000000"/>
+          <w:sz w:val="24"/>
+          <w:szCs w:val="24"/>
+          <w:u w:val="none"/>
+          <w:shd w:fill="auto" w:val="clear"/>
+          <w:vertAlign w:val="baseline"/>
+          <w:rtl w:val="0"/>
+        </w:rPr>
+        <w:t xml:space="preserve">dan </w:t>
+      </w:r>
+      <w:r>
+        <w:rPr>
+          <w:rFonts w:ascii="Times New Roman" w:cs="Times New Roman" w:eastAsia="Times New Roman" w:hAnsi="Times New Roman"/>
+          <w:b w:val="1"/>
+          <w:bCs w:val="1"/>
+          <w:i w:val="0"/>
+          <w:iCs w:val="0"/>
+          <w:smallCaps w:val="0"/>
+          <w:strike w:val="0"/>
+          <w:color w:val="000000"/>
+          <w:sz w:val="24"/>
+          <w:szCs w:val="24"/>
+          <w:u w:val="none"/>
+          <w:shd w:fill="auto" w:val="clear"/>
+          <w:vertAlign w:val="baseline"/>
+          <w:rtl w:val="0"/>
+        </w:rPr>
+        <w:t xml:space="preserve">12D Model </w:t>
+      </w:r>
+      <w:r>
+        <w:rPr>
+          <w:rFonts w:ascii="Times New Roman" w:cs="Times New Roman" w:eastAsia="Times New Roman" w:hAnsi="Times New Roman"/>
+          <w:b w:val="0"/>
+          <w:bCs w:val="0"/>
+          <w:i w:val="0"/>
+          <w:iCs w:val="0"/>
+          <w:smallCaps w:val="0"/>
+          <w:strike w:val="0"/>
+          <w:color w:val="000000"/>
+          <w:sz w:val="24"/>
+          <w:szCs w:val="24"/>
+          <w:u w:val="none"/>
+          <w:shd w:fill="auto" w:val="clear"/>
+          <w:vertAlign w:val="baseline"/>
+          <w:rtl w:val="0"/>
+        </w:rPr>
+        <w:t xml:space="preserve">untuk membuat laporan kemajuan tambang, perhitungan volume (</w:t>
+      </w:r>
+      <w:r>
+        <w:rPr>
+          <w:rFonts w:ascii="Times New Roman" w:cs="Times New Roman" w:eastAsia="Times New Roman" w:hAnsi="Times New Roman"/>
+          <w:b w:val="0"/>
+          <w:bCs w:val="0"/>
+          <w:i w:val="1"/>
+          <w:iCs w:val="1"/>
+          <w:smallCaps w:val="0"/>
+          <w:strike w:val="0"/>
+          <w:color w:val="000000"/>
+          <w:sz w:val="24"/>
+          <w:szCs w:val="24"/>
+          <w:u w:val="none"/>
+          <w:shd w:fill="auto" w:val="clear"/>
+          <w:vertAlign w:val="baseline"/>
+          <w:rtl w:val="0"/>
+        </w:rPr>
+        <w:t xml:space="preserve">cut/fill</w:t>
+      </w:r>
+      <w:r>
+        <w:rPr>
+          <w:rFonts w:ascii="Times New Roman" w:cs="Times New Roman" w:eastAsia="Times New Roman" w:hAnsi="Times New Roman"/>
+          <w:b w:val="0"/>
+          <w:bCs w:val="0"/>
+          <w:i w:val="0"/>
+          <w:iCs w:val="0"/>
+          <w:smallCaps w:val="0"/>
+          <w:strike w:val="0"/>
+          <w:color w:val="000000"/>
+          <w:sz w:val="24"/>
+          <w:szCs w:val="24"/>
+          <w:u w:val="none"/>
+          <w:shd w:fill="auto" w:val="clear"/>
+          <w:vertAlign w:val="baseline"/>
+          <w:rtl w:val="0"/>
+        </w:rPr>
+        <w:t xml:space="preserve">), dan pemodelan 3D. </w:t>
+      </w:r>
+    </w:p>
+    <w:p>
+      <w:pPr>
+        <w:keepNext w:val="0"/>
+        <w:keepLines w:val="0"/>
+        <w:pageBreakBefore w:val="0"/>
+        <w:widowControl w:val="0"/>
+        <w:pBdr>
+          <w:top w:space="0" w:sz="0" w:val="nil"/>
+          <w:left w:space="0" w:sz="0" w:val="nil"/>
+          <w:bottom w:space="0" w:sz="0" w:val="nil"/>
+          <w:right w:space="0" w:sz="0" w:val="nil"/>
+          <w:between w:space="0" w:sz="0" w:val="nil"/>
+        </w:pBdr>
+        <w:shd w:fill="auto" w:val="clear"/>
+        <w:spacing w:after="0" w:before="10.6854248046875" w:line="248.1566333770752" w:lineRule="auto"/>
+        <w:ind w:left="2167.9200744628906" w:right="347.225341796875" w:hanging="347.04010009765625"/>
+        <w:jc w:val="left"/>
+        <w:rPr>
+          <w:rFonts w:ascii="Times New Roman" w:cs="Times New Roman" w:eastAsia="Times New Roman" w:hAnsi="Times New Roman"/>
+          <w:b w:val="0"/>
+          <w:bCs w:val="0"/>
+          <w:i w:val="0"/>
+          <w:iCs w:val="0"/>
+          <w:smallCaps w:val="0"/>
+          <w:strike w:val="0"/>
+          <w:color w:val="000000"/>
+          <w:sz w:val="24"/>
+          <w:szCs w:val="24"/>
+          <w:u w:val="none"/>
+          <w:shd w:fill="auto" w:val="clear"/>
+          <w:vertAlign w:val="baseline"/>
+        </w:rPr>
+      </w:pPr>
+      <w:r>
+        <w:rPr>
+          <w:rFonts w:ascii="Arial" w:cs="Arial" w:eastAsia="Arial" w:hAnsi="Arial"/>
+          <w:b w:val="0"/>
+          <w:bCs w:val="0"/>
+          <w:i w:val="0"/>
+          <w:iCs w:val="0"/>
+          <w:smallCaps w:val="0"/>
+          <w:strike w:val="0"/>
+          <w:color w:val="000000"/>
+          <w:sz w:val="24"/>
+          <w:szCs w:val="24"/>
+          <w:u w:val="none"/>
+          <w:shd w:fill="auto" w:val="clear"/>
+          <w:vertAlign w:val="baseline"/>
+          <w:rtl w:val="0"/>
+        </w:rPr>
+        <w:t xml:space="preserve">● </w:t>
+      </w:r>
+      <w:r>
+        <w:rPr>
+          <w:rFonts w:ascii="Times New Roman" w:cs="Times New Roman" w:eastAsia="Times New Roman" w:hAnsi="Times New Roman"/>
+          <w:b w:val="0"/>
+          <w:bCs w:val="0"/>
+          <w:i w:val="0"/>
+          <w:iCs w:val="0"/>
+          <w:smallCaps w:val="0"/>
+          <w:strike w:val="0"/>
+          <w:color w:val="000000"/>
+          <w:sz w:val="24"/>
+          <w:szCs w:val="24"/>
+          <w:u w:val="none"/>
+          <w:shd w:fill="auto" w:val="clear"/>
+          <w:vertAlign w:val="baseline"/>
+          <w:rtl w:val="0"/>
+        </w:rPr>
+        <w:t xml:space="preserve">Berkolaborasi secara efektif dengan tim </w:t>
+      </w:r>
+      <w:r>
+        <w:rPr>
+          <w:rFonts w:ascii="Times New Roman" w:cs="Times New Roman" w:eastAsia="Times New Roman" w:hAnsi="Times New Roman"/>
+          <w:b w:val="0"/>
+          <w:bCs w:val="0"/>
+          <w:i w:val="1"/>
+          <w:iCs w:val="1"/>
+          <w:smallCaps w:val="0"/>
+          <w:strike w:val="0"/>
+          <w:color w:val="000000"/>
+          <w:sz w:val="24"/>
+          <w:szCs w:val="24"/>
+          <w:u w:val="none"/>
+          <w:shd w:fill="auto" w:val="clear"/>
+          <w:vertAlign w:val="baseline"/>
+          <w:rtl w:val="0"/>
+        </w:rPr>
+        <w:t xml:space="preserve">engineering </w:t>
+      </w:r>
+      <w:r>
+        <w:rPr>
+          <w:rFonts w:ascii="Times New Roman" w:cs="Times New Roman" w:eastAsia="Times New Roman" w:hAnsi="Times New Roman"/>
+          <w:b w:val="0"/>
+          <w:bCs w:val="0"/>
+          <w:i w:val="0"/>
+          <w:iCs w:val="0"/>
+          <w:smallCaps w:val="0"/>
+          <w:strike w:val="0"/>
+          <w:color w:val="000000"/>
+          <w:sz w:val="24"/>
+          <w:szCs w:val="24"/>
+          <w:u w:val="none"/>
+          <w:shd w:fill="auto" w:val="clear"/>
+          <w:vertAlign w:val="baseline"/>
+          <w:rtl w:val="0"/>
+        </w:rPr>
+        <w:t xml:space="preserve">dan produksi untuk memastikan data survei sesuai dengan kebutuhan operasional di lapangan. </w:t>
+      </w:r>
+    </w:p>
+    <w:p>
+      <w:pPr>
+        <w:keepNext w:val="0"/>
+        <w:keepLines w:val="0"/>
+        <w:pageBreakBefore w:val="0"/>
+        <w:widowControl w:val="0"/>
+        <w:pBdr>
+          <w:top w:space="0" w:sz="0" w:val="nil"/>
+          <w:left w:space="0" w:sz="0" w:val="nil"/>
+          <w:bottom w:space="0" w:sz="0" w:val="nil"/>
+          <w:right w:space="0" w:sz="0" w:val="nil"/>
+          <w:between w:space="0" w:sz="0" w:val="nil"/>
+        </w:pBdr>
+        <w:shd w:fill="auto" w:val="clear"/>
+        <w:spacing w:after="0" w:before="10.635986328125" w:line="248.15711975097656" w:lineRule="auto"/>
+        <w:ind w:left="2162.4000549316406" w:right="485.9002685546875" w:hanging="341.52008056640625"/>
+        <w:jc w:val="left"/>
+        <w:rPr>
+          <w:rFonts w:ascii="Times New Roman" w:cs="Times New Roman" w:eastAsia="Times New Roman" w:hAnsi="Times New Roman"/>
+          <w:b w:val="0"/>
+          <w:bCs w:val="0"/>
+          <w:i w:val="0"/>
+          <w:iCs w:val="0"/>
+          <w:smallCaps w:val="0"/>
+          <w:strike w:val="0"/>
+          <w:color w:val="000000"/>
+          <w:sz w:val="24"/>
+          <w:szCs w:val="24"/>
+          <w:u w:val="none"/>
+          <w:shd w:fill="auto" w:val="clear"/>
+          <w:vertAlign w:val="baseline"/>
+        </w:rPr>
+      </w:pPr>
+      <w:r>
+        <w:rPr>
+          <w:rFonts w:ascii="Arial" w:cs="Arial" w:eastAsia="Arial" w:hAnsi="Arial"/>
+          <w:b w:val="0"/>
+          <w:bCs w:val="0"/>
+          <w:i w:val="0"/>
+          <w:iCs w:val="0"/>
+          <w:smallCaps w:val="0"/>
+          <w:strike w:val="0"/>
+          <w:color w:val="000000"/>
+          <w:sz w:val="24"/>
+          <w:szCs w:val="24"/>
+          <w:u w:val="none"/>
+          <w:shd w:fill="auto" w:val="clear"/>
+          <w:vertAlign w:val="baseline"/>
+          <w:rtl w:val="0"/>
+        </w:rPr>
+        <w:t xml:space="preserve">● </w:t>
+      </w:r>
+      <w:r>
+        <w:rPr>
+          <w:rFonts w:ascii="Times New Roman" w:cs="Times New Roman" w:eastAsia="Times New Roman" w:hAnsi="Times New Roman"/>
+          <w:b w:val="0"/>
+          <w:bCs w:val="0"/>
+          <w:i w:val="0"/>
+          <w:iCs w:val="0"/>
+          <w:smallCaps w:val="0"/>
+          <w:strike w:val="0"/>
+          <w:color w:val="000000"/>
+          <w:sz w:val="24"/>
+          <w:szCs w:val="24"/>
+          <w:u w:val="none"/>
+          <w:shd w:fill="auto" w:val="clear"/>
+          <w:vertAlign w:val="baseline"/>
+          <w:rtl w:val="0"/>
+        </w:rPr>
+        <w:t xml:space="preserve">Menyiapkan laporan harian dan mingguan mengenai aktivitas dan hasil survei yang telah dilakukan. </w:t>
+      </w:r>
+    </w:p>
+    <w:p>
+      <w:pPr>
+        <w:keepNext w:val="0"/>
+        <w:keepLines w:val="0"/>
+        <w:pageBreakBefore w:val="0"/>
+        <w:widowControl w:val="0"/>
+        <w:pBdr>
+          <w:top w:space="0" w:sz="0" w:val="nil"/>
+          <w:left w:space="0" w:sz="0" w:val="nil"/>
+          <w:bottom w:space="0" w:sz="0" w:val="nil"/>
+          <w:right w:space="0" w:sz="0" w:val="nil"/>
+          <w:between w:space="0" w:sz="0" w:val="nil"/>
+        </w:pBdr>
+        <w:shd w:fill="auto" w:val="clear"/>
+        <w:spacing w:after="0" w:before="10.635986328125" w:line="248.15711975097656" w:lineRule="auto"/>
+        <w:ind w:left="2162.4000549316406" w:right="485.9002685546875" w:hanging="341.52008056640625"/>
+        <w:jc w:val="left"/>
+        <w:rPr>
+          <w:rFonts w:ascii="Times New Roman" w:cs="Times New Roman" w:eastAsia="Times New Roman" w:hAnsi="Times New Roman"/>
+          <w:sz w:val="24"/>
+          <w:szCs w:val="24"/>
+        </w:rPr>
+      </w:pPr>
+      <w:r>
+        <w:rPr>
+          <w:rtl w:val="0"/>
+        </w:rPr>
       </w:r>
     </w:p>
     <w:p>

</xml_diff>

<commit_message>
CV: semua foto center dan utuh, SIM dimunculkan
</commit_message>
<xml_diff>
--- a/cv/CV_DettaPranata.docx
+++ b/cv/CV_DettaPranata.docx
@@ -665,59 +665,42 @@
     </w:p>
     <w:p/>
     <w:p>
+      <w:pPr>
+        <w:ind w:left="1446.4999389648438" w:right="0" w:firstLine="0"/>
+      </w:pPr>
       <w:r>
         <w:rPr>
           <w:b/>
         </w:rPr>
-        <w:tab/>
-        <w:t xml:space="preserve">BPS Kabupaten Lahat </w:t>
-      </w:r>
-      <w:r>
-        <w:rPr/>
-        <w:t xml:space="preserve">| Lahat, Sumatra Selatan </w:t>
-      </w:r>
-      <w:r>
-        <w:rPr>
-          <w:i/>
-        </w:rPr>
-        <w:t>Juli 2026 – September 2026</w:t>
+        <w:t>BPS Kabupaten Lahat</w:t>
+      </w:r>
+      <w:r>
+        <w:t xml:space="preserve"> | Lahat, Sumatra Selatan Juli 2026 – September 2026</w:t>
       </w:r>
     </w:p>
     <w:p/>
     <w:p>
-      <w:r>
-        <w:rPr>
-          <w:b/>
-        </w:rPr>
-        <w:t>Pendataan Lapangan:</w:t>
-      </w:r>
-      <w:r>
-        <w:rPr/>
-        <w:t xml:space="preserve"> Melakukan pengumpulan data survei-survei BPS dengan mewawancarai responden secara langsung di wilayah Kabupaten Lahat.</w:t>
-      </w:r>
-    </w:p>
-    <w:p>
-      <w:r>
-        <w:rPr>
-          <w:b/>
-        </w:rPr>
-        <w:t>Akurasi Data:</w:t>
-      </w:r>
-      <w:r>
-        <w:rPr/>
-        <w:t xml:space="preserve"> Memastikan kelengkapan dan kebenaran data sesuai pedoman serta definisi operasional BPS, dan menyelesaikan target pendataan dalam tenggat waktu yang ditetapkan.</w:t>
-      </w:r>
-    </w:p>
-    <w:p>
-      <w:r>
-        <w:rPr>
-          <w:b/>
-        </w:rPr>
-        <w:t>Koordinasi:</w:t>
-      </w:r>
-      <w:r>
-        <w:rPr/>
-        <w:t xml:space="preserve"> Berkoordinasi dengan koordinator lapangan BPS untuk validasi data dan penyelesaian kendala selama kegiatan pendataan.</w:t>
+      <w:pPr>
+        <w:ind w:left="2161.9200134277344" w:right="939.27490234375" w:hanging="341.0400390625"/>
+      </w:pPr>
+      <w:r>
+        <w:t>● Pendataan Lapangan: Melakukan pengumpulan data survei-survei BPS dengan mewawancarai responden secara langsung di wilayah Kabupaten Lahat.</w:t>
+      </w:r>
+    </w:p>
+    <w:p>
+      <w:pPr>
+        <w:ind w:left="2161.9200134277344" w:right="939.27490234375" w:hanging="341.0400390625"/>
+      </w:pPr>
+      <w:r>
+        <w:t>● Akurasi Data: Memastikan kelengkapan dan kebenaran data sesuai pedoman serta definisi operasional BPS, dan menyelesaikan target pendataan dalam tenggat waktu yang ditetapkan.</w:t>
+      </w:r>
+    </w:p>
+    <w:p>
+      <w:pPr>
+        <w:ind w:left="2161.9200134277344" w:right="939.27490234375" w:hanging="341.0400390625"/>
+      </w:pPr>
+      <w:r>
+        <w:t>● Koordinasi: Berkoordinasi dengan koordinator lapangan BPS untuk validasi data dan penyelesaian kendala selama kegiatan pendataan.</w:t>
       </w:r>
     </w:p>
     <w:p>
@@ -3291,7 +3274,7 @@
         <w:shd w:fill="auto" w:val="clear"/>
         <w:spacing w:after="0" w:before="18.87939453125" w:line="240" w:lineRule="auto"/>
         <w:ind w:left="1820.8799743652344" w:right="0" w:firstLine="0"/>
-        <w:jc w:val="left"/>
+        <w:jc w:val="center"/>
         <w:rPr>
           <w:rFonts w:ascii="Times New Roman" w:cs="Times New Roman" w:eastAsia="Times New Roman" w:hAnsi="Times New Roman"/>
           <w:sz w:val="24"/>
@@ -3306,7 +3289,7 @@
         </w:rPr>
         <w:drawing>
           <wp:inline distB="114300" distT="114300" distL="114300" distR="114300">
-            <wp:extent cx="5198969" cy="7754983"/>
+            <wp:extent cx="5788800" cy="8640000"/>
             <wp:effectExtent b="0" l="0" r="0" t="0"/>
             <wp:docPr id="2" name="image6.jpg"/>
             <a:graphic>
@@ -3318,7 +3301,6 @@
                   </pic:nvPicPr>
                   <pic:blipFill>
                     <a:blip r:embed="rId8"/>
-                    <a:srcRect b="0" l="0" r="0" t="0"/>
                     <a:stretch>
                       <a:fillRect/>
                     </a:stretch>
@@ -3326,7 +3308,7 @@
                   <pic:spPr>
                     <a:xfrm>
                       <a:off x="0" y="0"/>
-                      <a:ext cx="5198969" cy="7754983"/>
+                      <a:ext cx="5788800" cy="8640000"/>
                     </a:xfrm>
                     <a:prstGeom prst="rect"/>
                     <a:ln/>
@@ -3678,7 +3660,7 @@
         <w:shd w:fill="auto" w:val="clear"/>
         <w:spacing w:after="0" w:before="18.87939453125" w:line="240" w:lineRule="auto"/>
         <w:ind w:left="0" w:right="0" w:firstLine="0"/>
-        <w:jc w:val="left"/>
+        <w:jc w:val="center"/>
         <w:rPr>
           <w:rFonts w:ascii="Times New Roman" w:cs="Times New Roman" w:eastAsia="Times New Roman" w:hAnsi="Times New Roman"/>
           <w:sz w:val="24"/>
@@ -3705,7 +3687,7 @@
             <wp:positionV relativeFrom="paragraph">
               <wp:posOffset>238125</wp:posOffset>
             </wp:positionV>
-            <wp:extent cx="7153275" cy="6250815"/>
+            <wp:extent cx="6807600" cy="4748301"/>
             <wp:effectExtent b="0" l="0" r="0" t="0"/>
             <wp:wrapSquare wrapText="bothSides" distB="114300" distT="114300" distL="114300" distR="114300"/>
             <wp:docPr id="8" name="image8.jpg"/>
@@ -3718,7 +3700,6 @@
                   </pic:nvPicPr>
                   <pic:blipFill>
                     <a:blip r:embed="rId9"/>
-                    <a:srcRect b="0" l="0" r="0" t="0"/>
                     <a:stretch>
                       <a:fillRect/>
                     </a:stretch>
@@ -3726,7 +3707,7 @@
                   <pic:spPr>
                     <a:xfrm>
                       <a:off x="0" y="0"/>
-                      <a:ext cx="7153275" cy="6250815"/>
+                      <a:ext cx="6807600" cy="4748301"/>
                     </a:xfrm>
                     <a:prstGeom prst="rect"/>
                     <a:ln/>
@@ -3754,7 +3735,7 @@
         <w:shd w:fill="auto" w:val="clear"/>
         <w:spacing w:after="0" w:before="0" w:line="310.6837749481201" w:lineRule="auto"/>
         <w:ind w:left="0" w:right="0" w:firstLine="0"/>
-        <w:jc w:val="left"/>
+        <w:jc w:val="center"/>
         <w:rPr>
           <w:rFonts w:ascii="Times New Roman" w:cs="Times New Roman" w:eastAsia="Times New Roman" w:hAnsi="Times New Roman"/>
           <w:b w:val="0"/>
@@ -3797,7 +3778,7 @@
         </w:rPr>
         <w:drawing>
           <wp:inline distB="19050" distT="19050" distL="19050" distR="19050">
-            <wp:extent cx="5734050" cy="6286500"/>
+            <wp:extent cx="6807600" cy="7455225"/>
             <wp:effectExtent b="0" l="0" r="0" t="0"/>
             <wp:docPr id="4" name="image2.png"/>
             <a:graphic>
@@ -3809,7 +3790,6 @@
                   </pic:nvPicPr>
                   <pic:blipFill>
                     <a:blip r:embed="rId10"/>
-                    <a:srcRect b="-12201" l="1752" r="-1752" t="12201"/>
                     <a:stretch>
                       <a:fillRect/>
                     </a:stretch>
@@ -3817,7 +3797,7 @@
                   <pic:spPr>
                     <a:xfrm>
                       <a:off x="0" y="0"/>
-                      <a:ext cx="5734050" cy="6286500"/>
+                      <a:ext cx="6807600" cy="7455225"/>
                     </a:xfrm>
                     <a:prstGeom prst="rect"/>
                     <a:ln/>
@@ -3885,7 +3865,7 @@
         </w:rPr>
         <w:drawing>
           <wp:inline distB="19050" distT="19050" distL="19050" distR="19050">
-            <wp:extent cx="5734050" cy="3562350"/>
+            <wp:extent cx="6807600" cy="4232158"/>
             <wp:effectExtent b="0" l="0" r="0" t="0"/>
             <wp:docPr id="6" name="image1.png"/>
             <a:graphic>
@@ -3897,7 +3877,6 @@
                   </pic:nvPicPr>
                   <pic:blipFill>
                     <a:blip r:embed="rId11"/>
-                    <a:srcRect b="0" l="0" r="0" t="0"/>
                     <a:stretch>
                       <a:fillRect/>
                     </a:stretch>
@@ -3905,7 +3884,7 @@
                   <pic:spPr>
                     <a:xfrm>
                       <a:off x="0" y="0"/>
-                      <a:ext cx="5734050" cy="3562350"/>
+                      <a:ext cx="6807600" cy="4232158"/>
                     </a:xfrm>
                     <a:prstGeom prst="rect"/>
                     <a:ln/>
@@ -3934,7 +3913,7 @@
         </w:rPr>
         <w:drawing>
           <wp:inline distB="19050" distT="19050" distL="19050" distR="19050">
-            <wp:extent cx="4962424" cy="6165784"/>
+            <wp:extent cx="6807600" cy="8462370"/>
             <wp:effectExtent b="0" l="0" r="0" t="0"/>
             <wp:docPr id="5" name="image3.png"/>
             <a:graphic>
@@ -3946,7 +3925,6 @@
                   </pic:nvPicPr>
                   <pic:blipFill>
                     <a:blip r:embed="rId12"/>
-                    <a:srcRect b="0" l="0" r="0" t="0"/>
                     <a:stretch>
                       <a:fillRect/>
                     </a:stretch>
@@ -3954,7 +3932,7 @@
                   <pic:spPr>
                     <a:xfrm>
                       <a:off x="0" y="0"/>
-                      <a:ext cx="4962424" cy="6165784"/>
+                      <a:ext cx="6807600" cy="8462370"/>
                     </a:xfrm>
                     <a:prstGeom prst="rect"/>
                     <a:ln/>
@@ -3972,17 +3950,9 @@
       </w:r>
       <w:r>
         <w:drawing>
-          <wp:anchor allowOverlap="1" behindDoc="1" distB="114300" distT="114300" distL="114300" distR="114300" hidden="0" layoutInCell="1" locked="0" relativeHeight="0" simplePos="0">
-            <wp:simplePos x="0" y="0"/>
-            <wp:positionH relativeFrom="column">
-              <wp:posOffset>757490</wp:posOffset>
-            </wp:positionH>
-            <wp:positionV relativeFrom="paragraph">
-              <wp:posOffset>4219912</wp:posOffset>
-            </wp:positionV>
-            <wp:extent cx="4086225" cy="6202318"/>
+          <wp:inline distT="0" distB="0" distL="0" distR="0">
+            <wp:extent cx="3996000" cy="8640000"/>
             <wp:effectExtent b="0" l="0" r="0" t="0"/>
-            <wp:wrapNone/>
             <wp:docPr id="3" name="image5.jpg"/>
             <a:graphic>
               <a:graphicData uri="http://schemas.openxmlformats.org/drawingml/2006/picture">
@@ -3993,7 +3963,6 @@
                   </pic:nvPicPr>
                   <pic:blipFill>
                     <a:blip r:embed="rId13"/>
-                    <a:srcRect b="0" l="0" r="0" t="0"/>
                     <a:stretch>
                       <a:fillRect/>
                     </a:stretch>
@@ -4001,7 +3970,7 @@
                   <pic:spPr>
                     <a:xfrm rot="16200000">
                       <a:off x="0" y="0"/>
-                      <a:ext cx="4086225" cy="6202318"/>
+                      <a:ext cx="3996000" cy="8640000"/>
                     </a:xfrm>
                     <a:prstGeom prst="rect"/>
                     <a:ln/>
@@ -4009,7 +3978,7 @@
                 </pic:pic>
               </a:graphicData>
             </a:graphic>
-          </wp:anchor>
+          </wp:inline>
         </w:drawing>
       </w:r>
     </w:p>
@@ -4595,7 +4564,7 @@
         </w:rPr>
         <w:drawing>
           <wp:inline distB="114300" distT="114300" distL="114300" distR="114300">
-            <wp:extent cx="5934075" cy="8995923"/>
+            <wp:extent cx="5691600" cy="8640000"/>
             <wp:effectExtent b="0" l="0" r="0" t="0"/>
             <wp:docPr id="1" name="image9.jpg"/>
             <a:graphic>
@@ -4607,7 +4576,6 @@
                   </pic:nvPicPr>
                   <pic:blipFill>
                     <a:blip r:embed="rId14"/>
-                    <a:srcRect b="0" l="0" r="0" t="0"/>
                     <a:stretch>
                       <a:fillRect/>
                     </a:stretch>
@@ -4615,7 +4583,7 @@
                   <pic:spPr>
                     <a:xfrm>
                       <a:off x="0" y="0"/>
-                      <a:ext cx="5934075" cy="8995923"/>
+                      <a:ext cx="5691600" cy="8640000"/>
                     </a:xfrm>
                     <a:prstGeom prst="rect"/>
                     <a:ln/>
@@ -4735,7 +4703,7 @@
         <w:shd w:fill="auto" w:val="clear"/>
         <w:spacing w:after="0" w:before="0" w:line="214.8872709274292" w:lineRule="auto"/>
         <w:ind w:left="0" w:right="240" w:firstLine="0"/>
-        <w:jc w:val="left"/>
+        <w:jc w:val="center"/>
         <w:rPr>
           <w:rFonts w:ascii="Times New Roman" w:cs="Times New Roman" w:eastAsia="Times New Roman" w:hAnsi="Times New Roman"/>
           <w:sz w:val="24"/>
@@ -4750,7 +4718,7 @@
         </w:rPr>
         <w:drawing>
           <wp:inline distB="114300" distT="114300" distL="114300" distR="114300">
-            <wp:extent cx="7191375" cy="9552391"/>
+            <wp:extent cx="5670000" cy="8640000"/>
             <wp:effectExtent b="0" l="0" r="0" t="0"/>
             <wp:docPr id="9" name="image7.jpg"/>
             <a:graphic>
@@ -4762,7 +4730,6 @@
                   </pic:nvPicPr>
                   <pic:blipFill>
                     <a:blip r:embed="rId15"/>
-                    <a:srcRect b="-1596" l="-26831" r="-22832" t="-2562"/>
                     <a:stretch>
                       <a:fillRect/>
                     </a:stretch>
@@ -4770,7 +4737,7 @@
                   <pic:spPr>
                     <a:xfrm>
                       <a:off x="0" y="0"/>
-                      <a:ext cx="7191375" cy="9552391"/>
+                      <a:ext cx="5670000" cy="8640000"/>
                     </a:xfrm>
                     <a:prstGeom prst="rect"/>
                     <a:ln/>

</xml_diff>

<commit_message>
CV: foto dikecilkan dgn margin aman dari tepi
</commit_message>
<xml_diff>
--- a/cv/CV_DettaPranata.docx
+++ b/cv/CV_DettaPranata.docx
@@ -3289,7 +3289,7 @@
         </w:rPr>
         <w:drawing>
           <wp:inline distB="114300" distT="114300" distL="114300" distR="114300">
-            <wp:extent cx="5788800" cy="8640000"/>
+            <wp:extent cx="5547600" cy="8280000"/>
             <wp:effectExtent b="0" l="0" r="0" t="0"/>
             <wp:docPr id="2" name="image6.jpg"/>
             <a:graphic>
@@ -3308,7 +3308,7 @@
                   <pic:spPr>
                     <a:xfrm>
                       <a:off x="0" y="0"/>
-                      <a:ext cx="5788800" cy="8640000"/>
+                      <a:ext cx="5547600" cy="8280000"/>
                     </a:xfrm>
                     <a:prstGeom prst="rect"/>
                     <a:ln/>
@@ -3687,7 +3687,7 @@
             <wp:positionV relativeFrom="paragraph">
               <wp:posOffset>238125</wp:posOffset>
             </wp:positionV>
-            <wp:extent cx="6807600" cy="4748301"/>
+            <wp:extent cx="5760000" cy="4017600"/>
             <wp:effectExtent b="0" l="0" r="0" t="0"/>
             <wp:wrapSquare wrapText="bothSides" distB="114300" distT="114300" distL="114300" distR="114300"/>
             <wp:docPr id="8" name="image8.jpg"/>
@@ -3707,7 +3707,7 @@
                   <pic:spPr>
                     <a:xfrm>
                       <a:off x="0" y="0"/>
-                      <a:ext cx="6807600" cy="4748301"/>
+                      <a:ext cx="5760000" cy="4017600"/>
                     </a:xfrm>
                     <a:prstGeom prst="rect"/>
                     <a:ln/>
@@ -3778,7 +3778,7 @@
         </w:rPr>
         <w:drawing>
           <wp:inline distB="19050" distT="19050" distL="19050" distR="19050">
-            <wp:extent cx="6807600" cy="7455225"/>
+            <wp:extent cx="5760000" cy="6307964"/>
             <wp:effectExtent b="0" l="0" r="0" t="0"/>
             <wp:docPr id="4" name="image2.png"/>
             <a:graphic>
@@ -3797,7 +3797,7 @@
                   <pic:spPr>
                     <a:xfrm>
                       <a:off x="0" y="0"/>
-                      <a:ext cx="6807600" cy="7455225"/>
+                      <a:ext cx="5760000" cy="6307964"/>
                     </a:xfrm>
                     <a:prstGeom prst="rect"/>
                     <a:ln/>
@@ -3865,7 +3865,7 @@
         </w:rPr>
         <w:drawing>
           <wp:inline distB="19050" distT="19050" distL="19050" distR="19050">
-            <wp:extent cx="6807600" cy="4232158"/>
+            <wp:extent cx="5760000" cy="3580884"/>
             <wp:effectExtent b="0" l="0" r="0" t="0"/>
             <wp:docPr id="6" name="image1.png"/>
             <a:graphic>
@@ -3884,7 +3884,7 @@
                   <pic:spPr>
                     <a:xfrm>
                       <a:off x="0" y="0"/>
-                      <a:ext cx="6807600" cy="4232158"/>
+                      <a:ext cx="5760000" cy="3580884"/>
                     </a:xfrm>
                     <a:prstGeom prst="rect"/>
                     <a:ln/>
@@ -3913,7 +3913,7 @@
         </w:rPr>
         <w:drawing>
           <wp:inline distB="19050" distT="19050" distL="19050" distR="19050">
-            <wp:extent cx="6807600" cy="8462370"/>
+            <wp:extent cx="5760000" cy="7160123"/>
             <wp:effectExtent b="0" l="0" r="0" t="0"/>
             <wp:docPr id="5" name="image3.png"/>
             <a:graphic>
@@ -3932,7 +3932,7 @@
                   <pic:spPr>
                     <a:xfrm>
                       <a:off x="0" y="0"/>
-                      <a:ext cx="6807600" cy="8462370"/>
+                      <a:ext cx="5760000" cy="7160123"/>
                     </a:xfrm>
                     <a:prstGeom prst="rect"/>
                     <a:ln/>
@@ -3951,7 +3951,7 @@
       <w:r>
         <w:drawing>
           <wp:inline distT="0" distB="0" distL="0" distR="0">
-            <wp:extent cx="3996000" cy="8640000"/>
+            <wp:extent cx="3829500" cy="8280000"/>
             <wp:effectExtent b="0" l="0" r="0" t="0"/>
             <wp:docPr id="3" name="image5.jpg"/>
             <a:graphic>
@@ -3970,7 +3970,7 @@
                   <pic:spPr>
                     <a:xfrm rot="16200000">
                       <a:off x="0" y="0"/>
-                      <a:ext cx="3996000" cy="8640000"/>
+                      <a:ext cx="3829500" cy="8280000"/>
                     </a:xfrm>
                     <a:prstGeom prst="rect"/>
                     <a:ln/>
@@ -4564,7 +4564,7 @@
         </w:rPr>
         <w:drawing>
           <wp:inline distB="114300" distT="114300" distL="114300" distR="114300">
-            <wp:extent cx="5691600" cy="8640000"/>
+            <wp:extent cx="5454450" cy="8280000"/>
             <wp:effectExtent b="0" l="0" r="0" t="0"/>
             <wp:docPr id="1" name="image9.jpg"/>
             <a:graphic>
@@ -4583,7 +4583,7 @@
                   <pic:spPr>
                     <a:xfrm>
                       <a:off x="0" y="0"/>
-                      <a:ext cx="5691600" cy="8640000"/>
+                      <a:ext cx="5454450" cy="8280000"/>
                     </a:xfrm>
                     <a:prstGeom prst="rect"/>
                     <a:ln/>
@@ -4718,7 +4718,7 @@
         </w:rPr>
         <w:drawing>
           <wp:inline distB="114300" distT="114300" distL="114300" distR="114300">
-            <wp:extent cx="5670000" cy="8640000"/>
+            <wp:extent cx="5433750" cy="8280000"/>
             <wp:effectExtent b="0" l="0" r="0" t="0"/>
             <wp:docPr id="9" name="image7.jpg"/>
             <a:graphic>
@@ -4737,7 +4737,7 @@
                   <pic:spPr>
                     <a:xfrm>
                       <a:off x="0" y="0"/>
-                      <a:ext cx="5670000" cy="8640000"/>
+                      <a:ext cx="5433750" cy="8280000"/>
                     </a:xfrm>
                     <a:prstGeom prst="rect"/>
                     <a:ln/>

</xml_diff>

<commit_message>
CV final: pas foto utuh, SIM landscape, semua foto center
</commit_message>
<xml_diff>
--- a/cv/CV_DettaPranata.docx
+++ b/cv/CV_DettaPranata.docx
@@ -3816,64 +3816,22 @@
     </w:p>
     <w:p>
       <w:pPr>
-        <w:keepNext w:val="0"/>
-        <w:keepLines w:val="0"/>
-        <w:pageBreakBefore w:val="0"/>
-        <w:widowControl w:val="0"/>
-        <w:pBdr>
-          <w:top w:space="0" w:sz="0" w:val="nil"/>
-          <w:left w:space="0" w:sz="0" w:val="nil"/>
-          <w:bottom w:space="0" w:sz="0" w:val="nil"/>
-          <w:right w:space="0" w:sz="0" w:val="nil"/>
-          <w:between w:space="0" w:sz="0" w:val="nil"/>
-        </w:pBdr>
-        <w:shd w:fill="auto" w:val="clear"/>
-        <w:spacing w:after="0" w:before="0" w:line="214.8872709274292" w:lineRule="auto"/>
-        <w:ind w:left="1440" w:right="240" w:firstLine="0"/>
         <w:jc w:val="center"/>
-        <w:rPr>
-          <w:rFonts w:ascii="Times New Roman" w:cs="Times New Roman" w:eastAsia="Times New Roman" w:hAnsi="Times New Roman"/>
-          <w:b w:val="0"/>
-          <w:bCs w:val="0"/>
-          <w:i w:val="0"/>
-          <w:iCs w:val="0"/>
-          <w:smallCaps w:val="0"/>
-          <w:strike w:val="0"/>
-          <w:color w:val="000000"/>
-          <w:sz w:val="24"/>
-          <w:szCs w:val="24"/>
-          <w:u w:val="none"/>
-          <w:shd w:fill="auto" w:val="clear"/>
-          <w:vertAlign w:val="baseline"/>
-        </w:rPr>
-      </w:pPr>
-      <w:r>
-        <w:rPr>
-          <w:rFonts w:ascii="Times New Roman" w:cs="Times New Roman" w:eastAsia="Times New Roman" w:hAnsi="Times New Roman"/>
-          <w:b w:val="0"/>
-          <w:bCs w:val="0"/>
-          <w:i w:val="0"/>
-          <w:iCs w:val="0"/>
-          <w:smallCaps w:val="0"/>
-          <w:strike w:val="0"/>
-          <w:color w:val="000000"/>
-          <w:sz w:val="24"/>
-          <w:szCs w:val="24"/>
-          <w:u w:val="none"/>
-          <w:shd w:fill="auto" w:val="clear"/>
-          <w:vertAlign w:val="baseline"/>
-        </w:rPr>
+      </w:pPr>
+      <w:r>
         <w:drawing>
-          <wp:inline distB="19050" distT="19050" distL="19050" distR="19050">
-            <wp:extent cx="5760000" cy="3580884"/>
-            <wp:effectExtent b="0" l="0" r="0" t="0"/>
-            <wp:docPr id="6" name="image1.png"/>
+          <wp:inline>
+            <wp:extent cx="5760000" cy="3580885"/>
+            <wp:docPr id="11" name="Picture 11"/>
+            <wp:cNvGraphicFramePr>
+              <a:graphicFrameLocks noChangeAspect="1"/>
+            </wp:cNvGraphicFramePr>
             <a:graphic>
               <a:graphicData uri="http://schemas.openxmlformats.org/drawingml/2006/picture">
                 <pic:pic>
                   <pic:nvPicPr>
-                    <pic:cNvPr id="0" name="image1.png"/>
-                    <pic:cNvPicPr preferRelativeResize="0"/>
+                    <pic:cNvPr id="0" name="image.png"/>
+                    <pic:cNvPicPr/>
                   </pic:nvPicPr>
                   <pic:blipFill>
                     <a:blip r:embed="rId11"/>
@@ -3884,10 +3842,9 @@
                   <pic:spPr>
                     <a:xfrm>
                       <a:off x="0" y="0"/>
-                      <a:ext cx="5760000" cy="3580884"/>
+                      <a:ext cx="5760000" cy="3580885"/>
                     </a:xfrm>
                     <a:prstGeom prst="rect"/>
-                    <a:ln/>
                   </pic:spPr>
                 </pic:pic>
               </a:graphicData>
@@ -3896,32 +3853,19 @@
         </w:drawing>
       </w:r>
       <w:r>
-        <w:rPr>
-          <w:rFonts w:ascii="Times New Roman" w:cs="Times New Roman" w:eastAsia="Times New Roman" w:hAnsi="Times New Roman"/>
-          <w:b w:val="0"/>
-          <w:bCs w:val="0"/>
-          <w:i w:val="0"/>
-          <w:iCs w:val="0"/>
-          <w:smallCaps w:val="0"/>
-          <w:strike w:val="0"/>
-          <w:color w:val="000000"/>
-          <w:sz w:val="24"/>
-          <w:szCs w:val="24"/>
-          <w:u w:val="none"/>
-          <w:shd w:fill="auto" w:val="clear"/>
-          <w:vertAlign w:val="baseline"/>
-        </w:rPr>
         <w:drawing>
-          <wp:inline distB="19050" distT="19050" distL="19050" distR="19050">
+          <wp:inline>
             <wp:extent cx="5760000" cy="7160123"/>
-            <wp:effectExtent b="0" l="0" r="0" t="0"/>
-            <wp:docPr id="5" name="image3.png"/>
+            <wp:docPr id="12" name="Picture 12"/>
+            <wp:cNvGraphicFramePr>
+              <a:graphicFrameLocks noChangeAspect="1"/>
+            </wp:cNvGraphicFramePr>
             <a:graphic>
               <a:graphicData uri="http://schemas.openxmlformats.org/drawingml/2006/picture">
                 <pic:pic>
                   <pic:nvPicPr>
-                    <pic:cNvPr id="0" name="image3.png"/>
-                    <pic:cNvPicPr preferRelativeResize="0"/>
+                    <pic:cNvPr id="0" name="image.png"/>
+                    <pic:cNvPicPr/>
                   </pic:nvPicPr>
                   <pic:blipFill>
                     <a:blip r:embed="rId12"/>
@@ -3935,7 +3879,6 @@
                       <a:ext cx="5760000" cy="7160123"/>
                     </a:xfrm>
                     <a:prstGeom prst="rect"/>
-                    <a:ln/>
                   </pic:spPr>
                 </pic:pic>
               </a:graphicData>
@@ -3944,22 +3887,19 @@
         </w:drawing>
       </w:r>
       <w:r>
-        <w:rPr>
-          <w:rtl w:val="0"/>
-        </w:rPr>
-      </w:r>
-      <w:r>
         <w:drawing>
-          <wp:inline distT="0" distB="0" distL="0" distR="0">
-            <wp:extent cx="3829500" cy="8280000"/>
-            <wp:effectExtent b="0" l="0" r="0" t="0"/>
-            <wp:docPr id="3" name="image5.jpg"/>
+          <wp:inline>
+            <wp:extent cx="5760000" cy="2664000"/>
+            <wp:docPr id="13" name="Picture 13"/>
+            <wp:cNvGraphicFramePr>
+              <a:graphicFrameLocks noChangeAspect="1"/>
+            </wp:cNvGraphicFramePr>
             <a:graphic>
               <a:graphicData uri="http://schemas.openxmlformats.org/drawingml/2006/picture">
                 <pic:pic>
                   <pic:nvPicPr>
-                    <pic:cNvPr id="0" name="image5.jpg"/>
-                    <pic:cNvPicPr preferRelativeResize="0"/>
+                    <pic:cNvPr id="0" name="image.jpg"/>
+                    <pic:cNvPicPr/>
                   </pic:nvPicPr>
                   <pic:blipFill>
                     <a:blip r:embed="rId13"/>
@@ -3968,12 +3908,11 @@
                     </a:stretch>
                   </pic:blipFill>
                   <pic:spPr>
-                    <a:xfrm rot="16200000">
+                    <a:xfrm>
                       <a:off x="0" y="0"/>
-                      <a:ext cx="3829500" cy="8280000"/>
+                      <a:ext cx="5760000" cy="2664000"/>
                     </a:xfrm>
                     <a:prstGeom prst="rect"/>
-                    <a:ln/>
                   </pic:spPr>
                 </pic:pic>
               </a:graphicData>

</xml_diff>

<commit_message>
CV final: SKCK dan surat sehat utuh + center
</commit_message>
<xml_diff>
--- a/cv/CV_DettaPranata.docx
+++ b/cv/CV_DettaPranata.docx
@@ -4474,44 +4474,22 @@
     </w:p>
     <w:p>
       <w:pPr>
-        <w:keepNext w:val="0"/>
-        <w:keepLines w:val="0"/>
-        <w:pageBreakBefore w:val="0"/>
-        <w:widowControl w:val="0"/>
-        <w:pBdr>
-          <w:top w:space="0" w:sz="0" w:val="nil"/>
-          <w:left w:space="0" w:sz="0" w:val="nil"/>
-          <w:bottom w:space="0" w:sz="0" w:val="nil"/>
-          <w:right w:space="0" w:sz="0" w:val="nil"/>
-          <w:between w:space="0" w:sz="0" w:val="nil"/>
-        </w:pBdr>
-        <w:shd w:fill="auto" w:val="clear"/>
-        <w:spacing w:after="0" w:before="0" w:line="214.8872709274292" w:lineRule="auto"/>
-        <w:ind w:left="1440" w:right="240" w:firstLine="0"/>
         <w:jc w:val="center"/>
-        <w:rPr>
-          <w:rFonts w:ascii="Times New Roman" w:cs="Times New Roman" w:eastAsia="Times New Roman" w:hAnsi="Times New Roman"/>
-          <w:sz w:val="24"/>
-          <w:szCs w:val="24"/>
-        </w:rPr>
-      </w:pPr>
-      <w:r>
-        <w:rPr>
-          <w:rFonts w:ascii="Times New Roman" w:cs="Times New Roman" w:eastAsia="Times New Roman" w:hAnsi="Times New Roman"/>
-          <w:sz w:val="24"/>
-          <w:szCs w:val="24"/>
-        </w:rPr>
+      </w:pPr>
+      <w:r>
         <w:drawing>
-          <wp:inline distB="114300" distT="114300" distL="114300" distR="114300">
-            <wp:extent cx="5454450" cy="8280000"/>
-            <wp:effectExtent b="0" l="0" r="0" t="0"/>
-            <wp:docPr id="1" name="image9.jpg"/>
+          <wp:inline>
+            <wp:extent cx="5760000" cy="8743833"/>
+            <wp:docPr id="15" name="Picture 15"/>
+            <wp:cNvGraphicFramePr>
+              <a:graphicFrameLocks noChangeAspect="1"/>
+            </wp:cNvGraphicFramePr>
             <a:graphic>
               <a:graphicData uri="http://schemas.openxmlformats.org/drawingml/2006/picture">
                 <pic:pic>
                   <pic:nvPicPr>
-                    <pic:cNvPr id="0" name="image9.jpg"/>
-                    <pic:cNvPicPr preferRelativeResize="0"/>
+                    <pic:cNvPr id="0" name="image.jpg"/>
+                    <pic:cNvPicPr/>
                   </pic:nvPicPr>
                   <pic:blipFill>
                     <a:blip r:embed="rId14"/>
@@ -4522,10 +4500,9 @@
                   <pic:spPr>
                     <a:xfrm>
                       <a:off x="0" y="0"/>
-                      <a:ext cx="5454450" cy="8280000"/>
+                      <a:ext cx="5760000" cy="8743833"/>
                     </a:xfrm>
                     <a:prstGeom prst="rect"/>
-                    <a:ln/>
                   </pic:spPr>
                 </pic:pic>
               </a:graphicData>
@@ -4533,11 +4510,6 @@
           </wp:inline>
         </w:drawing>
       </w:r>
-      <w:r>
-        <w:rPr>
-          <w:rtl w:val="0"/>
-        </w:rPr>
-      </w:r>
     </w:p>
     <w:p>
       <w:pPr>
@@ -4628,44 +4600,22 @@
     </w:p>
     <w:p>
       <w:pPr>
-        <w:keepNext w:val="0"/>
-        <w:keepLines w:val="0"/>
-        <w:pageBreakBefore w:val="0"/>
-        <w:widowControl w:val="0"/>
-        <w:pBdr>
-          <w:top w:space="0" w:sz="0" w:val="nil"/>
-          <w:left w:space="0" w:sz="0" w:val="nil"/>
-          <w:bottom w:space="0" w:sz="0" w:val="nil"/>
-          <w:right w:space="0" w:sz="0" w:val="nil"/>
-          <w:between w:space="0" w:sz="0" w:val="nil"/>
-        </w:pBdr>
-        <w:shd w:fill="auto" w:val="clear"/>
-        <w:spacing w:after="0" w:before="0" w:line="214.8872709274292" w:lineRule="auto"/>
-        <w:ind w:left="0" w:right="240" w:firstLine="0"/>
         <w:jc w:val="center"/>
-        <w:rPr>
-          <w:rFonts w:ascii="Times New Roman" w:cs="Times New Roman" w:eastAsia="Times New Roman" w:hAnsi="Times New Roman"/>
-          <w:sz w:val="24"/>
-          <w:szCs w:val="24"/>
-        </w:rPr>
-      </w:pPr>
-      <w:r>
-        <w:rPr>
-          <w:rFonts w:ascii="Times New Roman" w:cs="Times New Roman" w:eastAsia="Times New Roman" w:hAnsi="Times New Roman"/>
-          <w:sz w:val="24"/>
-          <w:szCs w:val="24"/>
-        </w:rPr>
+      </w:pPr>
+      <w:r>
         <w:drawing>
-          <wp:inline distB="114300" distT="114300" distL="114300" distR="114300">
-            <wp:extent cx="5433750" cy="8280000"/>
-            <wp:effectExtent b="0" l="0" r="0" t="0"/>
-            <wp:docPr id="9" name="image7.jpg"/>
+          <wp:inline>
+            <wp:extent cx="5760000" cy="8777143"/>
+            <wp:docPr id="14" name="Picture 14"/>
+            <wp:cNvGraphicFramePr>
+              <a:graphicFrameLocks noChangeAspect="1"/>
+            </wp:cNvGraphicFramePr>
             <a:graphic>
               <a:graphicData uri="http://schemas.openxmlformats.org/drawingml/2006/picture">
                 <pic:pic>
                   <pic:nvPicPr>
-                    <pic:cNvPr id="0" name="image7.jpg"/>
-                    <pic:cNvPicPr preferRelativeResize="0"/>
+                    <pic:cNvPr id="0" name="image.jpg"/>
+                    <pic:cNvPicPr/>
                   </pic:nvPicPr>
                   <pic:blipFill>
                     <a:blip r:embed="rId15"/>
@@ -4676,21 +4626,15 @@
                   <pic:spPr>
                     <a:xfrm>
                       <a:off x="0" y="0"/>
-                      <a:ext cx="5433750" cy="8280000"/>
+                      <a:ext cx="5760000" cy="8777143"/>
                     </a:xfrm>
                     <a:prstGeom prst="rect"/>
-                    <a:ln/>
                   </pic:spPr>
                 </pic:pic>
               </a:graphicData>
             </a:graphic>
           </wp:inline>
         </w:drawing>
-      </w:r>
-      <w:r>
-        <w:rPr>
-          <w:rtl w:val="0"/>
-        </w:rPr>
       </w:r>
     </w:p>
     <w:sectPr>

</xml_diff>